<commit_message>
Enhance documentation and improve code clarity in various scripts
</commit_message>
<xml_diff>
--- a/assets/Dominic Vicchiollo - Resume 2025.docx
+++ b/assets/Dominic Vicchiollo - Resume 2025.docx
@@ -311,6 +311,7 @@
           <w:rFonts w:ascii="Garamond" w:hAnsi="Garamond" w:cs="Arial"/>
         </w:rPr>
       </w:pPr>
+      <w:bookmarkStart w:id="0" w:name="_Hlk211452862"/>
       <w:r>
         <w:rPr>
           <w:rFonts w:ascii="Garamond" w:hAnsi="Garamond" w:cs="Arial"/>
@@ -444,7 +445,7 @@
           <w:sz w:val="18"/>
           <w:szCs w:val="18"/>
         </w:rPr>
-        <w:t xml:space="preserve"> Git/GitHub, Excel (VBA, Power Pivot, Power Query), JSON, YAML, Shell/Bash</w:t>
+        <w:t xml:space="preserve"> Git/GitHub, Excel (VBA, Power Pivot, Power Query), JSON, Shell/Bash</w:t>
       </w:r>
       <w:r>
         <w:rPr>
@@ -476,7 +477,7 @@
           <w:sz w:val="18"/>
           <w:szCs w:val="18"/>
         </w:rPr>
-        <w:t>, Power Apps,</w:t>
+        <w:t xml:space="preserve">, </w:t>
       </w:r>
     </w:p>
     <w:p>
@@ -495,7 +496,39 @@
           <w:sz w:val="18"/>
           <w:szCs w:val="18"/>
         </w:rPr>
-        <w:t>WinSCP/FileZilla</w:t>
+        <w:t>Power Apps,</w:t>
+      </w:r>
+      <w:r>
+        <w:rPr>
+          <w:rFonts w:ascii="Garamond" w:hAnsi="Garamond"/>
+          <w:sz w:val="18"/>
+          <w:szCs w:val="18"/>
+        </w:rPr>
+        <w:t xml:space="preserve"> </w:t>
+      </w:r>
+      <w:r>
+        <w:rPr>
+          <w:rFonts w:ascii="Garamond" w:hAnsi="Garamond"/>
+          <w:sz w:val="18"/>
+          <w:szCs w:val="18"/>
+        </w:rPr>
+        <w:t>WinSCP</w:t>
+      </w:r>
+      <w:r>
+        <w:rPr>
+          <w:rFonts w:ascii="Garamond" w:hAnsi="Garamond"/>
+          <w:sz w:val="18"/>
+          <w:szCs w:val="18"/>
+        </w:rPr>
+        <w:t xml:space="preserve">, </w:t>
+      </w:r>
+      <w:r>
+        <w:rPr>
+          <w:rFonts w:ascii="Garamond" w:hAnsi="Garamond"/>
+          <w:sz w:val="18"/>
+          <w:szCs w:val="18"/>
+        </w:rPr>
+        <w:t>FileZilla</w:t>
       </w:r>
       <w:r>
         <w:rPr>
@@ -1157,6 +1190,7 @@
         <w:t>learn, LSTM prototyping)</w:t>
       </w:r>
     </w:p>
+    <w:bookmarkEnd w:id="0"/>
     <w:p>
       <w:pPr>
         <w:pStyle w:val="Heading1"/>
@@ -2036,23 +2070,21 @@
         </w:rPr>
         <w:t xml:space="preserve"> </w:t>
       </w:r>
-      <w:proofErr w:type="gramStart"/>
       <w:r>
         <w:rPr>
           <w:rFonts w:ascii="Garamond" w:hAnsi="Garamond"/>
           <w:sz w:val="18"/>
           <w:szCs w:val="18"/>
         </w:rPr>
-        <w:t>running</w:t>
-      </w:r>
-      <w:proofErr w:type="gramEnd"/>
+        <w:t>leading</w:t>
+      </w:r>
       <w:r>
         <w:rPr>
           <w:rFonts w:ascii="Garamond" w:hAnsi="Garamond"/>
           <w:sz w:val="18"/>
           <w:szCs w:val="18"/>
         </w:rPr>
-        <w:t xml:space="preserve"> weekly stakeholder reviews, coordinating with solution architecture and customer success partners, and delivering C suite reporting with clear adoption, satisfaction, and value outcomes.</w:t>
+        <w:t xml:space="preserve"> weekly stakeholder reviews, coordinating with solution architecture and customer success partners, and delivering C suite reporting with clear adoption, and value outcomes.</w:t>
       </w:r>
     </w:p>
     <w:p>
@@ -4162,16 +4194,6 @@
         <w:br/>
       </w:r>
     </w:p>
-    <w:p>
-      <w:pPr>
-        <w:pStyle w:val="Heading2"/>
-        <w:spacing w:before="0"/>
-        <w:rPr>
-          <w:rFonts w:ascii="Garamond" w:hAnsi="Garamond" w:cs="Arial"/>
-          <w:color w:val="1F497D" w:themeColor="text2"/>
-        </w:rPr>
-      </w:pPr>
-    </w:p>
     <w:p/>
     <w:p/>
     <w:p>
@@ -4604,75 +4626,43 @@
         <w:ind w:left="540"/>
         <w:rPr>
           <w:rFonts w:ascii="Garamond" w:hAnsi="Garamond" w:cs="Arial"/>
-          <w:sz w:val="18"/>
-          <w:szCs w:val="18"/>
-        </w:rPr>
-      </w:pPr>
-      <w:r>
-        <w:rPr>
-          <w:rFonts w:ascii="Garamond" w:hAnsi="Garamond" w:cs="Arial"/>
-          <w:b/>
-          <w:bCs/>
-          <w:sz w:val="20"/>
-          <w:szCs w:val="20"/>
-        </w:rPr>
-        <w:t xml:space="preserve">Engineered and </w:t>
-      </w:r>
-      <w:r>
-        <w:rPr>
-          <w:rFonts w:ascii="Garamond" w:hAnsi="Garamond" w:cs="Arial"/>
-          <w:b/>
-          <w:bCs/>
-          <w:sz w:val="20"/>
-          <w:szCs w:val="20"/>
-        </w:rPr>
-        <w:t>O</w:t>
-      </w:r>
-      <w:r>
-        <w:rPr>
-          <w:rFonts w:ascii="Garamond" w:hAnsi="Garamond" w:cs="Arial"/>
-          <w:b/>
-          <w:bCs/>
-          <w:sz w:val="20"/>
-          <w:szCs w:val="20"/>
-        </w:rPr>
-        <w:t xml:space="preserve">perated ETL and ELT </w:t>
-      </w:r>
-      <w:r>
-        <w:rPr>
-          <w:rFonts w:ascii="Garamond" w:hAnsi="Garamond" w:cs="Arial"/>
-          <w:b/>
-          <w:bCs/>
-          <w:sz w:val="20"/>
-          <w:szCs w:val="20"/>
-        </w:rPr>
-        <w:t>P</w:t>
-      </w:r>
-      <w:r>
-        <w:rPr>
-          <w:rFonts w:ascii="Garamond" w:hAnsi="Garamond" w:cs="Arial"/>
-          <w:b/>
-          <w:bCs/>
-          <w:sz w:val="20"/>
-          <w:szCs w:val="20"/>
-        </w:rPr>
-        <w:t>ipelines</w:t>
-      </w:r>
-      <w:r>
-        <w:rPr>
-          <w:rFonts w:ascii="Garamond" w:hAnsi="Garamond" w:cs="Arial"/>
-          <w:sz w:val="20"/>
-          <w:szCs w:val="20"/>
-        </w:rPr>
-        <w:t xml:space="preserve"> </w:t>
-      </w:r>
-      <w:r>
-        <w:rPr>
-          <w:rFonts w:ascii="Garamond" w:hAnsi="Garamond" w:cs="Arial"/>
-          <w:sz w:val="18"/>
-          <w:szCs w:val="18"/>
-        </w:rPr>
-        <w:t>using SSMS and SQL, Python, SFTP, SSIS, and APIs to integrate enterprise data sources into curated datasets for analytics, aligning integrations and data contracts with customer requirements and leading practices.</w:t>
+          <w:sz w:val="20"/>
+          <w:szCs w:val="20"/>
+        </w:rPr>
+      </w:pPr>
+      <w:r>
+        <w:rPr>
+          <w:rFonts w:ascii="Garamond" w:hAnsi="Garamond" w:cs="Arial"/>
+          <w:b/>
+          <w:bCs/>
+          <w:sz w:val="20"/>
+          <w:szCs w:val="20"/>
+        </w:rPr>
+        <w:t xml:space="preserve">Consulted on Corporate MDM strategy and Digital Transformation </w:t>
+      </w:r>
+      <w:r>
+        <w:rPr>
+          <w:rFonts w:ascii="Garamond" w:hAnsi="Garamond" w:cs="Arial"/>
+          <w:sz w:val="20"/>
+          <w:szCs w:val="20"/>
+        </w:rPr>
+        <w:t>helping to plan, design and drive organization</w:t>
+      </w:r>
+      <w:r>
+        <w:rPr>
+          <w:rFonts w:ascii="Garamond" w:hAnsi="Garamond" w:cs="Arial"/>
+          <w:sz w:val="20"/>
+          <w:szCs w:val="20"/>
+        </w:rPr>
+        <w:t>al</w:t>
+      </w:r>
+      <w:r>
+        <w:rPr>
+          <w:rFonts w:ascii="Garamond" w:hAnsi="Garamond" w:cs="Arial"/>
+          <w:sz w:val="20"/>
+          <w:szCs w:val="20"/>
+        </w:rPr>
+        <w:t xml:space="preserve"> support to integrate our vendor product and pricing data, E-commerce &amp; customer data as well as ERP systems.</w:t>
       </w:r>
     </w:p>
     <w:p>
@@ -4698,131 +4688,15 @@
           <w:sz w:val="20"/>
           <w:szCs w:val="20"/>
         </w:rPr>
-        <w:t xml:space="preserve">Managed </w:t>
-      </w:r>
-      <w:r>
-        <w:rPr>
-          <w:rFonts w:ascii="Garamond" w:hAnsi="Garamond" w:cs="Arial"/>
-          <w:b/>
-          <w:bCs/>
-          <w:sz w:val="20"/>
-          <w:szCs w:val="20"/>
-        </w:rPr>
-        <w:t>D</w:t>
-      </w:r>
-      <w:r>
-        <w:rPr>
-          <w:rFonts w:ascii="Garamond" w:hAnsi="Garamond" w:cs="Arial"/>
-          <w:b/>
-          <w:bCs/>
-          <w:sz w:val="20"/>
-          <w:szCs w:val="20"/>
-        </w:rPr>
-        <w:t xml:space="preserve">atabase </w:t>
-      </w:r>
-      <w:r>
-        <w:rPr>
-          <w:rFonts w:ascii="Garamond" w:hAnsi="Garamond" w:cs="Arial"/>
-          <w:b/>
-          <w:bCs/>
-          <w:sz w:val="20"/>
-          <w:szCs w:val="20"/>
-        </w:rPr>
-        <w:t>H</w:t>
-      </w:r>
-      <w:r>
-        <w:rPr>
-          <w:rFonts w:ascii="Garamond" w:hAnsi="Garamond" w:cs="Arial"/>
-          <w:b/>
-          <w:bCs/>
-          <w:sz w:val="20"/>
-          <w:szCs w:val="20"/>
-        </w:rPr>
-        <w:t xml:space="preserve">ealth and </w:t>
-      </w:r>
-      <w:r>
-        <w:rPr>
-          <w:rFonts w:ascii="Garamond" w:hAnsi="Garamond" w:cs="Arial"/>
-          <w:b/>
-          <w:bCs/>
-          <w:sz w:val="20"/>
-          <w:szCs w:val="20"/>
-        </w:rPr>
-        <w:t>D</w:t>
-      </w:r>
-      <w:r>
-        <w:rPr>
-          <w:rFonts w:ascii="Garamond" w:hAnsi="Garamond" w:cs="Arial"/>
-          <w:b/>
-          <w:bCs/>
-          <w:sz w:val="20"/>
-          <w:szCs w:val="20"/>
-        </w:rPr>
-        <w:t xml:space="preserve">ata </w:t>
-      </w:r>
-      <w:r>
-        <w:rPr>
-          <w:rFonts w:ascii="Garamond" w:hAnsi="Garamond" w:cs="Arial"/>
-          <w:b/>
-          <w:bCs/>
-          <w:sz w:val="20"/>
-          <w:szCs w:val="20"/>
-        </w:rPr>
-        <w:t>Q</w:t>
-      </w:r>
-      <w:r>
-        <w:rPr>
-          <w:rFonts w:ascii="Garamond" w:hAnsi="Garamond" w:cs="Arial"/>
-          <w:b/>
-          <w:bCs/>
-          <w:sz w:val="20"/>
-          <w:szCs w:val="20"/>
-        </w:rPr>
-        <w:t xml:space="preserve">uality at </w:t>
-      </w:r>
-      <w:r>
-        <w:rPr>
-          <w:rFonts w:ascii="Garamond" w:hAnsi="Garamond" w:cs="Arial"/>
-          <w:b/>
-          <w:bCs/>
-          <w:sz w:val="20"/>
-          <w:szCs w:val="20"/>
-        </w:rPr>
-        <w:t>S</w:t>
-      </w:r>
-      <w:r>
-        <w:rPr>
-          <w:rFonts w:ascii="Garamond" w:hAnsi="Garamond" w:cs="Arial"/>
-          <w:b/>
-          <w:bCs/>
-          <w:sz w:val="20"/>
-          <w:szCs w:val="20"/>
-        </w:rPr>
-        <w:t>cale</w:t>
-      </w:r>
-      <w:r>
-        <w:rPr>
-          <w:rFonts w:ascii="Garamond" w:hAnsi="Garamond" w:cs="Arial"/>
-          <w:sz w:val="20"/>
-          <w:szCs w:val="20"/>
-        </w:rPr>
-        <w:t xml:space="preserve"> across multi</w:t>
-      </w:r>
-      <w:r>
-        <w:rPr>
-          <w:rFonts w:ascii="Garamond" w:hAnsi="Garamond" w:cs="Arial"/>
-          <w:sz w:val="20"/>
-          <w:szCs w:val="20"/>
-        </w:rPr>
-        <w:t>-</w:t>
-      </w:r>
-      <w:r>
-        <w:rPr>
-          <w:rFonts w:ascii="Garamond" w:hAnsi="Garamond" w:cs="Arial"/>
-          <w:sz w:val="20"/>
-          <w:szCs w:val="20"/>
-        </w:rPr>
-        <w:t>terabyte SQL environments by implementing rigorous checks, observability, and documentation, improving reliability, performance, and stakeholder confidence in critical reporting.</w:t>
+        <w:t xml:space="preserve">Executed Special Corporate Projects &amp; Data Integrations </w:t>
+      </w:r>
+      <w:r>
+        <w:rPr>
+          <w:rFonts w:ascii="Garamond" w:hAnsi="Garamond" w:cs="Arial"/>
+          <w:sz w:val="20"/>
+          <w:szCs w:val="20"/>
+        </w:rPr>
+        <w:t xml:space="preserve">including implementation of delivery routing software, financial auditing program, purchasing &amp; vendor audit programs. </w:t>
       </w:r>
     </w:p>
     <w:p>
@@ -4836,75 +4710,63 @@
         <w:ind w:left="540"/>
         <w:rPr>
           <w:rFonts w:ascii="Garamond" w:hAnsi="Garamond" w:cs="Arial"/>
-          <w:sz w:val="20"/>
-          <w:szCs w:val="20"/>
-        </w:rPr>
-      </w:pPr>
-      <w:r>
-        <w:rPr>
-          <w:rFonts w:ascii="Garamond" w:hAnsi="Garamond" w:cs="Arial"/>
-          <w:b/>
-          <w:bCs/>
-          <w:sz w:val="20"/>
-          <w:szCs w:val="20"/>
-        </w:rPr>
-        <w:t>C</w:t>
-      </w:r>
-      <w:r>
-        <w:rPr>
-          <w:rFonts w:ascii="Garamond" w:hAnsi="Garamond" w:cs="Arial"/>
-          <w:b/>
-          <w:bCs/>
-          <w:sz w:val="20"/>
-          <w:szCs w:val="20"/>
-        </w:rPr>
-        <w:t xml:space="preserve">ollaborated </w:t>
-      </w:r>
-      <w:r>
-        <w:rPr>
-          <w:rFonts w:ascii="Garamond" w:hAnsi="Garamond" w:cs="Arial"/>
-          <w:b/>
-          <w:bCs/>
-          <w:sz w:val="20"/>
-          <w:szCs w:val="20"/>
-        </w:rPr>
-        <w:t>C</w:t>
-      </w:r>
-      <w:r>
-        <w:rPr>
-          <w:rFonts w:ascii="Garamond" w:hAnsi="Garamond" w:cs="Arial"/>
-          <w:b/>
-          <w:bCs/>
-          <w:sz w:val="20"/>
-          <w:szCs w:val="20"/>
-        </w:rPr>
-        <w:t>ross-</w:t>
-      </w:r>
-      <w:r>
-        <w:rPr>
-          <w:rFonts w:ascii="Garamond" w:hAnsi="Garamond" w:cs="Arial"/>
-          <w:b/>
-          <w:bCs/>
-          <w:sz w:val="20"/>
-          <w:szCs w:val="20"/>
-        </w:rPr>
-        <w:t>F</w:t>
-      </w:r>
-      <w:r>
-        <w:rPr>
-          <w:rFonts w:ascii="Garamond" w:hAnsi="Garamond" w:cs="Arial"/>
-          <w:b/>
-          <w:bCs/>
-          <w:sz w:val="20"/>
-          <w:szCs w:val="20"/>
-        </w:rPr>
-        <w:t>unctionally</w:t>
-      </w:r>
-      <w:r>
-        <w:rPr>
-          <w:rFonts w:ascii="Garamond" w:hAnsi="Garamond" w:cs="Arial"/>
-          <w:b/>
-          <w:bCs/>
+          <w:sz w:val="18"/>
+          <w:szCs w:val="18"/>
+        </w:rPr>
+      </w:pPr>
+      <w:r>
+        <w:rPr>
+          <w:rFonts w:ascii="Garamond" w:hAnsi="Garamond" w:cs="Arial"/>
+          <w:b/>
+          <w:bCs/>
+          <w:sz w:val="20"/>
+          <w:szCs w:val="20"/>
+        </w:rPr>
+        <w:t xml:space="preserve">Engineered and </w:t>
+      </w:r>
+      <w:r>
+        <w:rPr>
+          <w:rFonts w:ascii="Garamond" w:hAnsi="Garamond" w:cs="Arial"/>
+          <w:b/>
+          <w:bCs/>
+          <w:sz w:val="20"/>
+          <w:szCs w:val="20"/>
+        </w:rPr>
+        <w:t>O</w:t>
+      </w:r>
+      <w:r>
+        <w:rPr>
+          <w:rFonts w:ascii="Garamond" w:hAnsi="Garamond" w:cs="Arial"/>
+          <w:b/>
+          <w:bCs/>
+          <w:sz w:val="20"/>
+          <w:szCs w:val="20"/>
+        </w:rPr>
+        <w:t xml:space="preserve">perated ETL and ELT </w:t>
+      </w:r>
+      <w:r>
+        <w:rPr>
+          <w:rFonts w:ascii="Garamond" w:hAnsi="Garamond" w:cs="Arial"/>
+          <w:b/>
+          <w:bCs/>
+          <w:sz w:val="20"/>
+          <w:szCs w:val="20"/>
+        </w:rPr>
+        <w:t>P</w:t>
+      </w:r>
+      <w:r>
+        <w:rPr>
+          <w:rFonts w:ascii="Garamond" w:hAnsi="Garamond" w:cs="Arial"/>
+          <w:b/>
+          <w:bCs/>
+          <w:sz w:val="20"/>
+          <w:szCs w:val="20"/>
+        </w:rPr>
+        <w:t>ipelines</w:t>
+      </w:r>
+      <w:r>
+        <w:rPr>
+          <w:rFonts w:ascii="Garamond" w:hAnsi="Garamond" w:cs="Arial"/>
           <w:sz w:val="20"/>
           <w:szCs w:val="20"/>
         </w:rPr>
@@ -4913,128 +4775,10 @@
       <w:r>
         <w:rPr>
           <w:rFonts w:ascii="Garamond" w:hAnsi="Garamond" w:cs="Arial"/>
-          <w:b/>
-          <w:bCs/>
-          <w:sz w:val="20"/>
-          <w:szCs w:val="20"/>
-        </w:rPr>
-        <w:t>on Data Migrations</w:t>
-      </w:r>
-      <w:r>
-        <w:rPr>
-          <w:rFonts w:ascii="Garamond" w:hAnsi="Garamond" w:cs="Arial"/>
-          <w:b/>
-          <w:bCs/>
-          <w:sz w:val="20"/>
-          <w:szCs w:val="20"/>
-        </w:rPr>
-        <w:t xml:space="preserve"> for</w:t>
-      </w:r>
-      <w:r>
-        <w:rPr>
-          <w:rFonts w:ascii="Garamond" w:hAnsi="Garamond" w:cs="Arial"/>
-          <w:b/>
-          <w:bCs/>
-          <w:sz w:val="20"/>
-          <w:szCs w:val="20"/>
-        </w:rPr>
-        <w:t xml:space="preserve"> Acquisitions</w:t>
-      </w:r>
-      <w:r>
-        <w:rPr>
-          <w:rFonts w:ascii="Garamond" w:hAnsi="Garamond" w:cs="Arial"/>
-          <w:sz w:val="19"/>
-          <w:szCs w:val="19"/>
-        </w:rPr>
-        <w:t xml:space="preserve"> across twenty four</w:t>
-      </w:r>
-      <w:r>
-        <w:rPr>
-          <w:rFonts w:ascii="Garamond" w:hAnsi="Garamond" w:cs="Arial"/>
-          <w:sz w:val="19"/>
-          <w:szCs w:val="19"/>
-        </w:rPr>
-        <w:t xml:space="preserve"> acquired companies</w:t>
-      </w:r>
-      <w:r>
-        <w:rPr>
-          <w:rFonts w:ascii="Garamond" w:hAnsi="Garamond" w:cs="Arial"/>
-          <w:sz w:val="19"/>
-          <w:szCs w:val="19"/>
-        </w:rPr>
-        <w:t xml:space="preserve"> by designing data workstreams</w:t>
-      </w:r>
-      <w:r>
-        <w:rPr>
-          <w:rFonts w:ascii="Garamond" w:hAnsi="Garamond" w:cs="Arial"/>
-          <w:sz w:val="19"/>
-          <w:szCs w:val="19"/>
-        </w:rPr>
-        <w:t xml:space="preserve"> for </w:t>
-      </w:r>
-      <w:r>
-        <w:rPr>
-          <w:rFonts w:ascii="Garamond" w:hAnsi="Garamond" w:cs="Arial"/>
-          <w:sz w:val="19"/>
-          <w:szCs w:val="19"/>
-        </w:rPr>
-        <w:t>system conversions and</w:t>
-      </w:r>
-      <w:r>
-        <w:rPr>
-          <w:rFonts w:ascii="Garamond" w:hAnsi="Garamond" w:cs="Arial"/>
-          <w:sz w:val="19"/>
-          <w:szCs w:val="19"/>
-        </w:rPr>
-        <w:t xml:space="preserve"> migration </w:t>
-      </w:r>
-      <w:r>
-        <w:rPr>
-          <w:rFonts w:ascii="Garamond" w:hAnsi="Garamond" w:cs="Arial"/>
-          <w:sz w:val="19"/>
-          <w:szCs w:val="19"/>
-        </w:rPr>
-        <w:t>routines and</w:t>
-      </w:r>
-      <w:r>
-        <w:rPr>
-          <w:rFonts w:ascii="Garamond" w:hAnsi="Garamond" w:cs="Arial"/>
-          <w:sz w:val="19"/>
-          <w:szCs w:val="19"/>
-        </w:rPr>
-        <w:t xml:space="preserve"> delivering </w:t>
-      </w:r>
-      <w:r>
-        <w:rPr>
-          <w:rFonts w:ascii="Garamond" w:hAnsi="Garamond" w:cs="Arial"/>
-          <w:sz w:val="19"/>
-          <w:szCs w:val="19"/>
-        </w:rPr>
-        <w:t>post-acquisition</w:t>
-      </w:r>
-      <w:r>
-        <w:rPr>
-          <w:rFonts w:ascii="Garamond" w:hAnsi="Garamond" w:cs="Arial"/>
-          <w:sz w:val="19"/>
-          <w:szCs w:val="19"/>
-        </w:rPr>
-        <w:t xml:space="preserve"> reporting and reconciliations that ensured </w:t>
-      </w:r>
-      <w:r>
-        <w:rPr>
-          <w:rFonts w:ascii="Garamond" w:hAnsi="Garamond" w:cs="Arial"/>
-          <w:sz w:val="19"/>
-          <w:szCs w:val="19"/>
-        </w:rPr>
-        <w:t>data quality and accuracy</w:t>
-      </w:r>
-      <w:r>
-        <w:rPr>
-          <w:rFonts w:ascii="Garamond" w:hAnsi="Garamond" w:cs="Arial"/>
-          <w:sz w:val="19"/>
-          <w:szCs w:val="19"/>
-        </w:rPr>
-        <w:t>.</w:t>
+          <w:sz w:val="18"/>
+          <w:szCs w:val="18"/>
+        </w:rPr>
+        <w:t>using SSMS and SQL, Python, SFTP, SSIS, and APIs to integrate enterprise data sources into curated datasets for analytics, aligning integrations and data contracts with customer requirements and leading practices.</w:t>
       </w:r>
     </w:p>
     <w:p>
@@ -5060,227 +4804,131 @@
           <w:sz w:val="20"/>
           <w:szCs w:val="20"/>
         </w:rPr>
-        <w:t xml:space="preserve">Created a </w:t>
-      </w:r>
-      <w:r>
-        <w:rPr>
-          <w:rFonts w:ascii="Garamond" w:hAnsi="Garamond" w:cs="Arial"/>
-          <w:b/>
-          <w:bCs/>
-          <w:sz w:val="20"/>
-          <w:szCs w:val="20"/>
-        </w:rPr>
-        <w:t>F</w:t>
-      </w:r>
-      <w:r>
-        <w:rPr>
-          <w:rFonts w:ascii="Garamond" w:hAnsi="Garamond" w:cs="Arial"/>
-          <w:b/>
-          <w:bCs/>
-          <w:sz w:val="20"/>
-          <w:szCs w:val="20"/>
-        </w:rPr>
-        <w:t xml:space="preserve">inancial </w:t>
-      </w:r>
-      <w:r>
-        <w:rPr>
-          <w:rFonts w:ascii="Garamond" w:hAnsi="Garamond" w:cs="Arial"/>
-          <w:b/>
-          <w:bCs/>
-          <w:sz w:val="20"/>
-          <w:szCs w:val="20"/>
-        </w:rPr>
-        <w:t>A</w:t>
-      </w:r>
-      <w:r>
-        <w:rPr>
-          <w:rFonts w:ascii="Garamond" w:hAnsi="Garamond" w:cs="Arial"/>
-          <w:b/>
-          <w:bCs/>
-          <w:sz w:val="20"/>
-          <w:szCs w:val="20"/>
-        </w:rPr>
-        <w:t xml:space="preserve">udit </w:t>
-      </w:r>
-      <w:r>
-        <w:rPr>
-          <w:rFonts w:ascii="Garamond" w:hAnsi="Garamond" w:cs="Arial"/>
-          <w:b/>
-          <w:bCs/>
-          <w:sz w:val="20"/>
-          <w:szCs w:val="20"/>
-        </w:rPr>
-        <w:t>P</w:t>
-      </w:r>
-      <w:r>
-        <w:rPr>
-          <w:rFonts w:ascii="Garamond" w:hAnsi="Garamond" w:cs="Arial"/>
-          <w:b/>
-          <w:bCs/>
-          <w:sz w:val="20"/>
-          <w:szCs w:val="20"/>
-        </w:rPr>
-        <w:t xml:space="preserve">rogram </w:t>
-      </w:r>
-      <w:r>
-        <w:rPr>
-          <w:rFonts w:ascii="Garamond" w:hAnsi="Garamond" w:cs="Arial"/>
-          <w:b/>
-          <w:bCs/>
-          <w:sz w:val="20"/>
-          <w:szCs w:val="20"/>
-        </w:rPr>
-        <w:t xml:space="preserve">of Eclipse ERP </w:t>
-      </w:r>
-      <w:r>
-        <w:rPr>
-          <w:rFonts w:ascii="Garamond" w:hAnsi="Garamond" w:cs="Arial"/>
-          <w:b/>
-          <w:bCs/>
-          <w:sz w:val="20"/>
-          <w:szCs w:val="20"/>
-        </w:rPr>
-        <w:t>Financial</w:t>
-      </w:r>
-      <w:r>
-        <w:rPr>
-          <w:rFonts w:ascii="Garamond" w:hAnsi="Garamond" w:cs="Arial"/>
-          <w:b/>
-          <w:bCs/>
-          <w:sz w:val="20"/>
-          <w:szCs w:val="20"/>
-        </w:rPr>
-        <w:t xml:space="preserve"> G/L</w:t>
-      </w:r>
-      <w:r>
-        <w:rPr>
-          <w:rFonts w:ascii="Garamond" w:hAnsi="Garamond" w:cs="Arial"/>
-          <w:b/>
-          <w:bCs/>
-          <w:sz w:val="20"/>
-          <w:szCs w:val="20"/>
-        </w:rPr>
-        <w:t xml:space="preserve"> Accounts </w:t>
-      </w:r>
-      <w:r>
-        <w:rPr>
-          <w:rFonts w:ascii="Garamond" w:hAnsi="Garamond" w:cs="Arial"/>
-          <w:sz w:val="20"/>
-          <w:szCs w:val="20"/>
-        </w:rPr>
-        <w:t xml:space="preserve">with </w:t>
-      </w:r>
-      <w:r>
-        <w:rPr>
-          <w:rFonts w:ascii="Garamond" w:hAnsi="Garamond" w:cs="Arial"/>
-          <w:sz w:val="20"/>
-          <w:szCs w:val="20"/>
-        </w:rPr>
-        <w:t>m</w:t>
-      </w:r>
-      <w:r>
-        <w:rPr>
-          <w:rFonts w:ascii="Garamond" w:hAnsi="Garamond" w:cs="Arial"/>
-          <w:sz w:val="20"/>
-          <w:szCs w:val="20"/>
-        </w:rPr>
-        <w:t xml:space="preserve">easurable </w:t>
-      </w:r>
-      <w:r>
-        <w:rPr>
-          <w:rFonts w:ascii="Garamond" w:hAnsi="Garamond" w:cs="Arial"/>
-          <w:sz w:val="20"/>
-          <w:szCs w:val="20"/>
-        </w:rPr>
-        <w:t>i</w:t>
-      </w:r>
-      <w:r>
-        <w:rPr>
-          <w:rFonts w:ascii="Garamond" w:hAnsi="Garamond" w:cs="Arial"/>
-          <w:sz w:val="20"/>
-          <w:szCs w:val="20"/>
-        </w:rPr>
-        <w:t>mpact</w:t>
-      </w:r>
-      <w:r>
-        <w:rPr>
-          <w:rFonts w:ascii="Garamond" w:hAnsi="Garamond" w:cs="Arial"/>
-          <w:sz w:val="20"/>
-          <w:szCs w:val="20"/>
-        </w:rPr>
-        <w:t xml:space="preserve"> for approximately </w:t>
-      </w:r>
-      <w:r>
-        <w:rPr>
-          <w:rFonts w:ascii="Garamond" w:hAnsi="Garamond" w:cs="Arial"/>
-          <w:sz w:val="20"/>
-          <w:szCs w:val="20"/>
-        </w:rPr>
-        <w:t>$210M</w:t>
-      </w:r>
-      <w:r>
-        <w:rPr>
-          <w:rFonts w:ascii="Garamond" w:hAnsi="Garamond" w:cs="Arial"/>
-          <w:sz w:val="20"/>
-          <w:szCs w:val="20"/>
-        </w:rPr>
-        <w:t xml:space="preserve"> in inventory that improved variance tracking and issue resolution, uncovered more than </w:t>
-      </w:r>
-      <w:r>
-        <w:rPr>
-          <w:rFonts w:ascii="Garamond" w:hAnsi="Garamond" w:cs="Arial"/>
-          <w:sz w:val="20"/>
-          <w:szCs w:val="20"/>
-        </w:rPr>
-        <w:t>$225k</w:t>
-      </w:r>
-      <w:r>
-        <w:rPr>
-          <w:rFonts w:ascii="Garamond" w:hAnsi="Garamond" w:cs="Arial"/>
-          <w:sz w:val="20"/>
-          <w:szCs w:val="20"/>
-        </w:rPr>
-        <w:t xml:space="preserve"> in unclaimed rebates annually,</w:t>
-      </w:r>
-      <w:r>
-        <w:rPr>
-          <w:rFonts w:ascii="Garamond" w:hAnsi="Garamond" w:cs="Arial"/>
-          <w:sz w:val="20"/>
-          <w:szCs w:val="20"/>
-        </w:rPr>
-        <w:t xml:space="preserve"> </w:t>
-      </w:r>
-      <w:r>
-        <w:rPr>
-          <w:rFonts w:ascii="Garamond" w:hAnsi="Garamond" w:cs="Arial"/>
-          <w:sz w:val="20"/>
-          <w:szCs w:val="20"/>
-        </w:rPr>
-        <w:t xml:space="preserve">exposed </w:t>
-      </w:r>
-      <w:r>
-        <w:rPr>
-          <w:rFonts w:ascii="Garamond" w:hAnsi="Garamond" w:cs="Arial"/>
-          <w:sz w:val="20"/>
-          <w:szCs w:val="20"/>
-        </w:rPr>
-        <w:t xml:space="preserve">and developed </w:t>
-      </w:r>
-      <w:r>
-        <w:rPr>
-          <w:rFonts w:ascii="Garamond" w:hAnsi="Garamond" w:cs="Arial"/>
-          <w:sz w:val="20"/>
-          <w:szCs w:val="20"/>
-        </w:rPr>
-        <w:t xml:space="preserve">improvement strategy for </w:t>
-      </w:r>
-      <w:r>
-        <w:rPr>
-          <w:rFonts w:ascii="Garamond" w:hAnsi="Garamond" w:cs="Arial"/>
-          <w:sz w:val="20"/>
-          <w:szCs w:val="20"/>
-        </w:rPr>
-        <w:t>process gaps that were driving general ledger leakage.</w:t>
+        <w:t xml:space="preserve">Managed </w:t>
+      </w:r>
+      <w:r>
+        <w:rPr>
+          <w:rFonts w:ascii="Garamond" w:hAnsi="Garamond" w:cs="Arial"/>
+          <w:b/>
+          <w:bCs/>
+          <w:sz w:val="20"/>
+          <w:szCs w:val="20"/>
+        </w:rPr>
+        <w:t>D</w:t>
+      </w:r>
+      <w:r>
+        <w:rPr>
+          <w:rFonts w:ascii="Garamond" w:hAnsi="Garamond" w:cs="Arial"/>
+          <w:b/>
+          <w:bCs/>
+          <w:sz w:val="20"/>
+          <w:szCs w:val="20"/>
+        </w:rPr>
+        <w:t xml:space="preserve">atabase </w:t>
+      </w:r>
+      <w:r>
+        <w:rPr>
+          <w:rFonts w:ascii="Garamond" w:hAnsi="Garamond" w:cs="Arial"/>
+          <w:b/>
+          <w:bCs/>
+          <w:sz w:val="20"/>
+          <w:szCs w:val="20"/>
+        </w:rPr>
+        <w:t>H</w:t>
+      </w:r>
+      <w:r>
+        <w:rPr>
+          <w:rFonts w:ascii="Garamond" w:hAnsi="Garamond" w:cs="Arial"/>
+          <w:b/>
+          <w:bCs/>
+          <w:sz w:val="20"/>
+          <w:szCs w:val="20"/>
+        </w:rPr>
+        <w:t xml:space="preserve">ealth and </w:t>
+      </w:r>
+      <w:r>
+        <w:rPr>
+          <w:rFonts w:ascii="Garamond" w:hAnsi="Garamond" w:cs="Arial"/>
+          <w:b/>
+          <w:bCs/>
+          <w:sz w:val="20"/>
+          <w:szCs w:val="20"/>
+        </w:rPr>
+        <w:t>D</w:t>
+      </w:r>
+      <w:r>
+        <w:rPr>
+          <w:rFonts w:ascii="Garamond" w:hAnsi="Garamond" w:cs="Arial"/>
+          <w:b/>
+          <w:bCs/>
+          <w:sz w:val="20"/>
+          <w:szCs w:val="20"/>
+        </w:rPr>
+        <w:t xml:space="preserve">ata </w:t>
+      </w:r>
+      <w:r>
+        <w:rPr>
+          <w:rFonts w:ascii="Garamond" w:hAnsi="Garamond" w:cs="Arial"/>
+          <w:b/>
+          <w:bCs/>
+          <w:sz w:val="20"/>
+          <w:szCs w:val="20"/>
+        </w:rPr>
+        <w:t>Q</w:t>
+      </w:r>
+      <w:r>
+        <w:rPr>
+          <w:rFonts w:ascii="Garamond" w:hAnsi="Garamond" w:cs="Arial"/>
+          <w:b/>
+          <w:bCs/>
+          <w:sz w:val="20"/>
+          <w:szCs w:val="20"/>
+        </w:rPr>
+        <w:t xml:space="preserve">uality at </w:t>
+      </w:r>
+      <w:r>
+        <w:rPr>
+          <w:rFonts w:ascii="Garamond" w:hAnsi="Garamond" w:cs="Arial"/>
+          <w:b/>
+          <w:bCs/>
+          <w:sz w:val="20"/>
+          <w:szCs w:val="20"/>
+        </w:rPr>
+        <w:t>S</w:t>
+      </w:r>
+      <w:r>
+        <w:rPr>
+          <w:rFonts w:ascii="Garamond" w:hAnsi="Garamond" w:cs="Arial"/>
+          <w:b/>
+          <w:bCs/>
+          <w:sz w:val="20"/>
+          <w:szCs w:val="20"/>
+        </w:rPr>
+        <w:t>cale</w:t>
+      </w:r>
+      <w:r>
+        <w:rPr>
+          <w:rFonts w:ascii="Garamond" w:hAnsi="Garamond" w:cs="Arial"/>
+          <w:sz w:val="20"/>
+          <w:szCs w:val="20"/>
+        </w:rPr>
+        <w:t xml:space="preserve"> across multi</w:t>
+      </w:r>
+      <w:r>
+        <w:rPr>
+          <w:rFonts w:ascii="Garamond" w:hAnsi="Garamond" w:cs="Arial"/>
+          <w:sz w:val="20"/>
+          <w:szCs w:val="20"/>
+        </w:rPr>
+        <w:t>-</w:t>
+      </w:r>
+      <w:r>
+        <w:rPr>
+          <w:rFonts w:ascii="Garamond" w:hAnsi="Garamond" w:cs="Arial"/>
+          <w:sz w:val="20"/>
+          <w:szCs w:val="20"/>
+        </w:rPr>
+        <w:t>terabyte SQL environments by implementing rigorous checks, observability, and documentation, improving reliability, performance, and stakeholder confidence in critical reporting.</w:t>
       </w:r>
     </w:p>
     <w:p>
@@ -5306,237 +4954,193 @@
           <w:sz w:val="20"/>
           <w:szCs w:val="20"/>
         </w:rPr>
-        <w:t xml:space="preserve">Consulted </w:t>
-      </w:r>
-      <w:r>
-        <w:rPr>
-          <w:rFonts w:ascii="Garamond" w:hAnsi="Garamond" w:cs="Arial"/>
-          <w:b/>
-          <w:bCs/>
-          <w:sz w:val="20"/>
-          <w:szCs w:val="20"/>
-        </w:rPr>
-        <w:t xml:space="preserve">on </w:t>
-      </w:r>
-      <w:r>
-        <w:rPr>
-          <w:rFonts w:ascii="Garamond" w:hAnsi="Garamond" w:cs="Arial"/>
-          <w:b/>
-          <w:bCs/>
-          <w:sz w:val="20"/>
-          <w:szCs w:val="20"/>
-        </w:rPr>
-        <w:t>Corporate</w:t>
-      </w:r>
-      <w:r>
-        <w:rPr>
-          <w:rFonts w:ascii="Garamond" w:hAnsi="Garamond" w:cs="Arial"/>
-          <w:b/>
-          <w:bCs/>
-          <w:sz w:val="20"/>
-          <w:szCs w:val="20"/>
-        </w:rPr>
-        <w:t xml:space="preserve"> Project </w:t>
-      </w:r>
-      <w:r>
-        <w:rPr>
-          <w:rFonts w:ascii="Garamond" w:hAnsi="Garamond" w:cs="Arial"/>
-          <w:b/>
-          <w:bCs/>
-          <w:sz w:val="20"/>
-          <w:szCs w:val="20"/>
-        </w:rPr>
-        <w:t>Initiatives</w:t>
-      </w:r>
-      <w:r>
-        <w:rPr>
-          <w:rFonts w:ascii="Garamond" w:hAnsi="Garamond" w:cs="Arial"/>
-          <w:b/>
-          <w:bCs/>
-          <w:sz w:val="20"/>
-          <w:szCs w:val="20"/>
-        </w:rPr>
-        <w:t xml:space="preserve"> and Data Integrations </w:t>
-      </w:r>
-      <w:r>
-        <w:rPr>
-          <w:rFonts w:ascii="Garamond" w:hAnsi="Garamond" w:cs="Arial"/>
-          <w:sz w:val="20"/>
-          <w:szCs w:val="20"/>
-        </w:rPr>
-        <w:t>involving</w:t>
-      </w:r>
-      <w:r>
-        <w:rPr>
-          <w:rFonts w:ascii="Garamond" w:hAnsi="Garamond" w:cs="Arial"/>
-          <w:sz w:val="20"/>
-          <w:szCs w:val="20"/>
-        </w:rPr>
-        <w:t xml:space="preserve"> implementation of</w:t>
-      </w:r>
-      <w:r>
-        <w:rPr>
-          <w:rFonts w:ascii="Garamond" w:hAnsi="Garamond" w:cs="Arial"/>
-          <w:sz w:val="20"/>
-          <w:szCs w:val="20"/>
-        </w:rPr>
-        <w:t xml:space="preserve"> delivery r</w:t>
-      </w:r>
-      <w:r>
-        <w:rPr>
-          <w:rFonts w:ascii="Garamond" w:hAnsi="Garamond" w:cs="Arial"/>
-          <w:sz w:val="20"/>
-          <w:szCs w:val="20"/>
-        </w:rPr>
-        <w:t>outing</w:t>
-      </w:r>
-      <w:r>
-        <w:rPr>
-          <w:rFonts w:ascii="Garamond" w:hAnsi="Garamond" w:cs="Arial"/>
-          <w:sz w:val="20"/>
-          <w:szCs w:val="20"/>
-        </w:rPr>
-        <w:t xml:space="preserve"> software</w:t>
-      </w:r>
-      <w:r>
-        <w:rPr>
-          <w:rFonts w:ascii="Garamond" w:hAnsi="Garamond" w:cs="Arial"/>
-          <w:sz w:val="20"/>
-          <w:szCs w:val="20"/>
-        </w:rPr>
-        <w:t xml:space="preserve">, financial auditing program, </w:t>
-      </w:r>
-      <w:r>
-        <w:rPr>
-          <w:rFonts w:ascii="Garamond" w:hAnsi="Garamond" w:cs="Arial"/>
-          <w:sz w:val="20"/>
-          <w:szCs w:val="20"/>
-        </w:rPr>
-        <w:t>purchasing</w:t>
-      </w:r>
-      <w:r>
-        <w:rPr>
-          <w:rFonts w:ascii="Garamond" w:hAnsi="Garamond" w:cs="Arial"/>
-          <w:sz w:val="20"/>
-          <w:szCs w:val="20"/>
-        </w:rPr>
-        <w:t xml:space="preserve"> &amp; </w:t>
-      </w:r>
-      <w:r>
-        <w:rPr>
-          <w:rFonts w:ascii="Garamond" w:hAnsi="Garamond" w:cs="Arial"/>
-          <w:sz w:val="20"/>
-          <w:szCs w:val="20"/>
-        </w:rPr>
-        <w:t xml:space="preserve">vendor audit programs. </w:t>
-      </w:r>
-    </w:p>
-    <w:p>
-      <w:pPr>
-        <w:spacing w:after="0" w:line="324" w:lineRule="auto"/>
-        <w:ind w:left="274"/>
-        <w:rPr>
-          <w:rFonts w:ascii="Garamond" w:hAnsi="Garamond" w:cs="Arial"/>
-          <w:sz w:val="20"/>
-          <w:szCs w:val="20"/>
-        </w:rPr>
-      </w:pPr>
-    </w:p>
-    <w:p>
-      <w:pPr>
-        <w:pStyle w:val="Heading2"/>
-        <w:rPr>
-          <w:rFonts w:ascii="Garamond" w:hAnsi="Garamond" w:cs="Arial"/>
-          <w:color w:val="1F497D" w:themeColor="text2"/>
-        </w:rPr>
-      </w:pPr>
-      <w:r>
-        <w:rPr>
-          <w:rFonts w:ascii="Garamond" w:hAnsi="Garamond" w:cs="Arial"/>
-          <w:color w:val="1F497D" w:themeColor="text2"/>
-        </w:rPr>
-        <w:t xml:space="preserve">Business Process Analyst </w:t>
-      </w:r>
-      <w:r>
-        <w:rPr>
-          <w:rFonts w:ascii="Garamond" w:hAnsi="Garamond" w:cs="Arial"/>
-          <w:color w:val="1F497D" w:themeColor="text2"/>
+        <w:t>C</w:t>
+      </w:r>
+      <w:r>
+        <w:rPr>
+          <w:rFonts w:ascii="Garamond" w:hAnsi="Garamond" w:cs="Arial"/>
+          <w:b/>
+          <w:bCs/>
+          <w:sz w:val="20"/>
+          <w:szCs w:val="20"/>
+        </w:rPr>
+        <w:t xml:space="preserve">ollaborated </w:t>
+      </w:r>
+      <w:r>
+        <w:rPr>
+          <w:rFonts w:ascii="Garamond" w:hAnsi="Garamond" w:cs="Arial"/>
+          <w:b/>
+          <w:bCs/>
+          <w:sz w:val="20"/>
+          <w:szCs w:val="20"/>
+        </w:rPr>
+        <w:t>C</w:t>
+      </w:r>
+      <w:r>
+        <w:rPr>
+          <w:rFonts w:ascii="Garamond" w:hAnsi="Garamond" w:cs="Arial"/>
+          <w:b/>
+          <w:bCs/>
+          <w:sz w:val="20"/>
+          <w:szCs w:val="20"/>
+        </w:rPr>
+        <w:t>ross-</w:t>
+      </w:r>
+      <w:r>
+        <w:rPr>
+          <w:rFonts w:ascii="Garamond" w:hAnsi="Garamond" w:cs="Arial"/>
+          <w:b/>
+          <w:bCs/>
+          <w:sz w:val="20"/>
+          <w:szCs w:val="20"/>
+        </w:rPr>
+        <w:t>F</w:t>
+      </w:r>
+      <w:r>
+        <w:rPr>
+          <w:rFonts w:ascii="Garamond" w:hAnsi="Garamond" w:cs="Arial"/>
+          <w:b/>
+          <w:bCs/>
+          <w:sz w:val="20"/>
+          <w:szCs w:val="20"/>
+        </w:rPr>
+        <w:t>unctionally</w:t>
+      </w:r>
+      <w:r>
+        <w:rPr>
+          <w:rFonts w:ascii="Garamond" w:hAnsi="Garamond" w:cs="Arial"/>
+          <w:b/>
+          <w:bCs/>
+          <w:sz w:val="20"/>
+          <w:szCs w:val="20"/>
         </w:rPr>
         <w:t xml:space="preserve"> </w:t>
       </w:r>
       <w:r>
         <w:rPr>
           <w:rFonts w:ascii="Garamond" w:hAnsi="Garamond" w:cs="Arial"/>
-          <w:color w:val="1F497D" w:themeColor="text2"/>
-        </w:rPr>
-        <w:t xml:space="preserve"> </w:t>
-      </w:r>
-      <w:r>
-        <w:rPr>
-          <w:rFonts w:ascii="Garamond" w:hAnsi="Garamond" w:cs="Arial"/>
-          <w:color w:val="1F497D" w:themeColor="text2"/>
-        </w:rPr>
-        <w:t>Sonepar</w:t>
-      </w:r>
-      <w:r>
-        <w:rPr>
-          <w:rFonts w:ascii="Garamond" w:hAnsi="Garamond" w:cs="Arial"/>
-          <w:color w:val="1F497D" w:themeColor="text2"/>
-        </w:rPr>
-        <w:t>-VES</w:t>
-      </w:r>
-      <w:r>
-        <w:rPr>
-          <w:rFonts w:ascii="Garamond" w:hAnsi="Garamond" w:cs="Arial"/>
-          <w:color w:val="1F497D" w:themeColor="text2"/>
-        </w:rPr>
-        <w:t xml:space="preserve"> </w:t>
-      </w:r>
-      <w:r>
-        <w:rPr>
-          <w:rFonts w:ascii="Garamond" w:hAnsi="Garamond" w:cs="Arial"/>
-          <w:color w:val="1F497D" w:themeColor="text2"/>
-          <w:sz w:val="16"/>
-          <w:szCs w:val="16"/>
-        </w:rPr>
-        <w:t xml:space="preserve">– </w:t>
-      </w:r>
-      <w:r>
-        <w:rPr>
-          <w:rFonts w:ascii="Garamond" w:hAnsi="Garamond" w:cs="Arial"/>
-          <w:color w:val="1F497D" w:themeColor="text2"/>
-          <w:sz w:val="16"/>
-          <w:szCs w:val="16"/>
-        </w:rPr>
-        <w:t>Minneapolis</w:t>
-      </w:r>
-      <w:r>
-        <w:rPr>
-          <w:rFonts w:ascii="Garamond" w:hAnsi="Garamond" w:cs="Arial"/>
-          <w:color w:val="1F497D" w:themeColor="text2"/>
-          <w:sz w:val="16"/>
-          <w:szCs w:val="16"/>
-        </w:rPr>
-        <w:t>, MN</w:t>
-      </w:r>
-    </w:p>
-    <w:p>
-      <w:pPr>
-        <w:rPr>
-          <w:rFonts w:ascii="Garamond" w:hAnsi="Garamond" w:cs="Arial"/>
-          <w:b/>
-          <w:bCs/>
-          <w:color w:val="1F497D" w:themeColor="text2"/>
-        </w:rPr>
-      </w:pPr>
-      <w:r>
-        <w:rPr>
-          <w:rFonts w:ascii="Garamond" w:hAnsi="Garamond" w:cs="Arial"/>
-          <w:b/>
-          <w:bCs/>
-          <w:color w:val="1F497D" w:themeColor="text2"/>
-        </w:rPr>
-        <w:t>May 2017 – Nov 2020</w:t>
+          <w:b/>
+          <w:bCs/>
+          <w:sz w:val="20"/>
+          <w:szCs w:val="20"/>
+        </w:rPr>
+        <w:t>on Data Migrations</w:t>
+      </w:r>
+      <w:r>
+        <w:rPr>
+          <w:rFonts w:ascii="Garamond" w:hAnsi="Garamond" w:cs="Arial"/>
+          <w:b/>
+          <w:bCs/>
+          <w:sz w:val="20"/>
+          <w:szCs w:val="20"/>
+        </w:rPr>
+        <w:t xml:space="preserve"> for</w:t>
+      </w:r>
+      <w:r>
+        <w:rPr>
+          <w:rFonts w:ascii="Garamond" w:hAnsi="Garamond" w:cs="Arial"/>
+          <w:b/>
+          <w:bCs/>
+          <w:sz w:val="20"/>
+          <w:szCs w:val="20"/>
+        </w:rPr>
+        <w:t xml:space="preserve"> Acquisitions</w:t>
+      </w:r>
+      <w:r>
+        <w:rPr>
+          <w:rFonts w:ascii="Garamond" w:hAnsi="Garamond" w:cs="Arial"/>
+          <w:sz w:val="19"/>
+          <w:szCs w:val="19"/>
+        </w:rPr>
+        <w:t xml:space="preserve"> across twenty four</w:t>
+      </w:r>
+      <w:r>
+        <w:rPr>
+          <w:rFonts w:ascii="Garamond" w:hAnsi="Garamond" w:cs="Arial"/>
+          <w:sz w:val="19"/>
+          <w:szCs w:val="19"/>
+        </w:rPr>
+        <w:t xml:space="preserve"> acquired companies</w:t>
+      </w:r>
+      <w:r>
+        <w:rPr>
+          <w:rFonts w:ascii="Garamond" w:hAnsi="Garamond" w:cs="Arial"/>
+          <w:sz w:val="19"/>
+          <w:szCs w:val="19"/>
+        </w:rPr>
+        <w:t xml:space="preserve"> by designing data workstreams</w:t>
+      </w:r>
+      <w:r>
+        <w:rPr>
+          <w:rFonts w:ascii="Garamond" w:hAnsi="Garamond" w:cs="Arial"/>
+          <w:sz w:val="19"/>
+          <w:szCs w:val="19"/>
+        </w:rPr>
+        <w:t xml:space="preserve"> for </w:t>
+      </w:r>
+      <w:r>
+        <w:rPr>
+          <w:rFonts w:ascii="Garamond" w:hAnsi="Garamond" w:cs="Arial"/>
+          <w:sz w:val="19"/>
+          <w:szCs w:val="19"/>
+        </w:rPr>
+        <w:t>system conversions and</w:t>
+      </w:r>
+      <w:r>
+        <w:rPr>
+          <w:rFonts w:ascii="Garamond" w:hAnsi="Garamond" w:cs="Arial"/>
+          <w:sz w:val="19"/>
+          <w:szCs w:val="19"/>
+        </w:rPr>
+        <w:t xml:space="preserve"> migration </w:t>
+      </w:r>
+      <w:r>
+        <w:rPr>
+          <w:rFonts w:ascii="Garamond" w:hAnsi="Garamond" w:cs="Arial"/>
+          <w:sz w:val="19"/>
+          <w:szCs w:val="19"/>
+        </w:rPr>
+        <w:t>routines and</w:t>
+      </w:r>
+      <w:r>
+        <w:rPr>
+          <w:rFonts w:ascii="Garamond" w:hAnsi="Garamond" w:cs="Arial"/>
+          <w:sz w:val="19"/>
+          <w:szCs w:val="19"/>
+        </w:rPr>
+        <w:t xml:space="preserve"> delivering </w:t>
+      </w:r>
+      <w:r>
+        <w:rPr>
+          <w:rFonts w:ascii="Garamond" w:hAnsi="Garamond" w:cs="Arial"/>
+          <w:sz w:val="19"/>
+          <w:szCs w:val="19"/>
+        </w:rPr>
+        <w:t>post-acquisition</w:t>
+      </w:r>
+      <w:r>
+        <w:rPr>
+          <w:rFonts w:ascii="Garamond" w:hAnsi="Garamond" w:cs="Arial"/>
+          <w:sz w:val="19"/>
+          <w:szCs w:val="19"/>
+        </w:rPr>
+        <w:t xml:space="preserve"> reporting and reconciliations that ensured </w:t>
+      </w:r>
+      <w:r>
+        <w:rPr>
+          <w:rFonts w:ascii="Garamond" w:hAnsi="Garamond" w:cs="Arial"/>
+          <w:sz w:val="19"/>
+          <w:szCs w:val="19"/>
+        </w:rPr>
+        <w:t>data quality and accuracy</w:t>
+      </w:r>
+      <w:r>
+        <w:rPr>
+          <w:rFonts w:ascii="Garamond" w:hAnsi="Garamond" w:cs="Arial"/>
+          <w:sz w:val="19"/>
+          <w:szCs w:val="19"/>
+        </w:rPr>
+        <w:t>.</w:t>
       </w:r>
     </w:p>
     <w:p>
@@ -5562,107 +5166,187 @@
           <w:sz w:val="20"/>
           <w:szCs w:val="20"/>
         </w:rPr>
-        <w:t xml:space="preserve">Collaborated with </w:t>
-      </w:r>
-      <w:r>
-        <w:rPr>
-          <w:rFonts w:ascii="Garamond" w:hAnsi="Garamond" w:cs="Arial"/>
-          <w:b/>
-          <w:bCs/>
-          <w:sz w:val="20"/>
-          <w:szCs w:val="20"/>
-        </w:rPr>
-        <w:t>B</w:t>
-      </w:r>
-      <w:r>
-        <w:rPr>
-          <w:rFonts w:ascii="Garamond" w:hAnsi="Garamond" w:cs="Arial"/>
-          <w:b/>
-          <w:bCs/>
-          <w:sz w:val="20"/>
-          <w:szCs w:val="20"/>
-        </w:rPr>
-        <w:t xml:space="preserve">usiness </w:t>
-      </w:r>
-      <w:r>
-        <w:rPr>
-          <w:rFonts w:ascii="Garamond" w:hAnsi="Garamond" w:cs="Arial"/>
-          <w:b/>
-          <w:bCs/>
-          <w:sz w:val="20"/>
-          <w:szCs w:val="20"/>
-        </w:rPr>
-        <w:t>L</w:t>
-      </w:r>
-      <w:r>
-        <w:rPr>
-          <w:rFonts w:ascii="Garamond" w:hAnsi="Garamond" w:cs="Arial"/>
-          <w:b/>
-          <w:bCs/>
-          <w:sz w:val="20"/>
-          <w:szCs w:val="20"/>
-        </w:rPr>
-        <w:t xml:space="preserve">eaders to </w:t>
-      </w:r>
-      <w:r>
-        <w:rPr>
-          <w:rFonts w:ascii="Garamond" w:hAnsi="Garamond" w:cs="Arial"/>
-          <w:b/>
-          <w:bCs/>
-          <w:sz w:val="20"/>
-          <w:szCs w:val="20"/>
-        </w:rPr>
-        <w:t>D</w:t>
-      </w:r>
-      <w:r>
-        <w:rPr>
-          <w:rFonts w:ascii="Garamond" w:hAnsi="Garamond" w:cs="Arial"/>
-          <w:b/>
-          <w:bCs/>
-          <w:sz w:val="20"/>
-          <w:szCs w:val="20"/>
-        </w:rPr>
-        <w:t xml:space="preserve">efine KPI </w:t>
-      </w:r>
-      <w:r>
-        <w:rPr>
-          <w:rFonts w:ascii="Garamond" w:hAnsi="Garamond" w:cs="Arial"/>
-          <w:b/>
-          <w:bCs/>
-          <w:sz w:val="20"/>
-          <w:szCs w:val="20"/>
-        </w:rPr>
-        <w:t>D</w:t>
-      </w:r>
-      <w:r>
-        <w:rPr>
-          <w:rFonts w:ascii="Garamond" w:hAnsi="Garamond" w:cs="Arial"/>
-          <w:b/>
-          <w:bCs/>
-          <w:sz w:val="20"/>
-          <w:szCs w:val="20"/>
-        </w:rPr>
-        <w:t xml:space="preserve">riven </w:t>
-      </w:r>
-      <w:r>
-        <w:rPr>
-          <w:rFonts w:ascii="Garamond" w:hAnsi="Garamond" w:cs="Arial"/>
-          <w:b/>
-          <w:bCs/>
-          <w:sz w:val="20"/>
-          <w:szCs w:val="20"/>
-        </w:rPr>
-        <w:t>R</w:t>
-      </w:r>
-      <w:r>
-        <w:rPr>
-          <w:rFonts w:ascii="Garamond" w:hAnsi="Garamond" w:cs="Arial"/>
-          <w:b/>
-          <w:bCs/>
-          <w:sz w:val="20"/>
-          <w:szCs w:val="20"/>
-        </w:rPr>
-        <w:t>eporting</w:t>
+        <w:t xml:space="preserve">Created a </w:t>
+      </w:r>
+      <w:r>
+        <w:rPr>
+          <w:rFonts w:ascii="Garamond" w:hAnsi="Garamond" w:cs="Arial"/>
+          <w:b/>
+          <w:bCs/>
+          <w:sz w:val="20"/>
+          <w:szCs w:val="20"/>
+        </w:rPr>
+        <w:t>F</w:t>
+      </w:r>
+      <w:r>
+        <w:rPr>
+          <w:rFonts w:ascii="Garamond" w:hAnsi="Garamond" w:cs="Arial"/>
+          <w:b/>
+          <w:bCs/>
+          <w:sz w:val="20"/>
+          <w:szCs w:val="20"/>
+        </w:rPr>
+        <w:t xml:space="preserve">inancial </w:t>
+      </w:r>
+      <w:r>
+        <w:rPr>
+          <w:rFonts w:ascii="Garamond" w:hAnsi="Garamond" w:cs="Arial"/>
+          <w:b/>
+          <w:bCs/>
+          <w:sz w:val="20"/>
+          <w:szCs w:val="20"/>
+        </w:rPr>
+        <w:t>A</w:t>
+      </w:r>
+      <w:r>
+        <w:rPr>
+          <w:rFonts w:ascii="Garamond" w:hAnsi="Garamond" w:cs="Arial"/>
+          <w:b/>
+          <w:bCs/>
+          <w:sz w:val="20"/>
+          <w:szCs w:val="20"/>
+        </w:rPr>
+        <w:t xml:space="preserve">udit </w:t>
+      </w:r>
+      <w:r>
+        <w:rPr>
+          <w:rFonts w:ascii="Garamond" w:hAnsi="Garamond" w:cs="Arial"/>
+          <w:b/>
+          <w:bCs/>
+          <w:sz w:val="20"/>
+          <w:szCs w:val="20"/>
+        </w:rPr>
+        <w:t>P</w:t>
+      </w:r>
+      <w:r>
+        <w:rPr>
+          <w:rFonts w:ascii="Garamond" w:hAnsi="Garamond" w:cs="Arial"/>
+          <w:b/>
+          <w:bCs/>
+          <w:sz w:val="20"/>
+          <w:szCs w:val="20"/>
+        </w:rPr>
+        <w:t xml:space="preserve">rogram </w:t>
+      </w:r>
+      <w:r>
+        <w:rPr>
+          <w:rFonts w:ascii="Garamond" w:hAnsi="Garamond" w:cs="Arial"/>
+          <w:b/>
+          <w:bCs/>
+          <w:sz w:val="20"/>
+          <w:szCs w:val="20"/>
+        </w:rPr>
+        <w:t xml:space="preserve">of Eclipse ERP </w:t>
+      </w:r>
+      <w:r>
+        <w:rPr>
+          <w:rFonts w:ascii="Garamond" w:hAnsi="Garamond" w:cs="Arial"/>
+          <w:b/>
+          <w:bCs/>
+          <w:sz w:val="20"/>
+          <w:szCs w:val="20"/>
+        </w:rPr>
+        <w:t>Financial</w:t>
+      </w:r>
+      <w:r>
+        <w:rPr>
+          <w:rFonts w:ascii="Garamond" w:hAnsi="Garamond" w:cs="Arial"/>
+          <w:b/>
+          <w:bCs/>
+          <w:sz w:val="20"/>
+          <w:szCs w:val="20"/>
+        </w:rPr>
+        <w:t xml:space="preserve"> G/L</w:t>
+      </w:r>
+      <w:r>
+        <w:rPr>
+          <w:rFonts w:ascii="Garamond" w:hAnsi="Garamond" w:cs="Arial"/>
+          <w:b/>
+          <w:bCs/>
+          <w:sz w:val="20"/>
+          <w:szCs w:val="20"/>
+        </w:rPr>
+        <w:t xml:space="preserve"> Accounts </w:t>
+      </w:r>
+      <w:r>
+        <w:rPr>
+          <w:rFonts w:ascii="Garamond" w:hAnsi="Garamond" w:cs="Arial"/>
+          <w:sz w:val="20"/>
+          <w:szCs w:val="20"/>
+        </w:rPr>
+        <w:t xml:space="preserve">with </w:t>
+      </w:r>
+      <w:r>
+        <w:rPr>
+          <w:rFonts w:ascii="Garamond" w:hAnsi="Garamond" w:cs="Arial"/>
+          <w:sz w:val="20"/>
+          <w:szCs w:val="20"/>
+        </w:rPr>
+        <w:t>m</w:t>
+      </w:r>
+      <w:r>
+        <w:rPr>
+          <w:rFonts w:ascii="Garamond" w:hAnsi="Garamond" w:cs="Arial"/>
+          <w:sz w:val="20"/>
+          <w:szCs w:val="20"/>
+        </w:rPr>
+        <w:t xml:space="preserve">easurable </w:t>
+      </w:r>
+      <w:r>
+        <w:rPr>
+          <w:rFonts w:ascii="Garamond" w:hAnsi="Garamond" w:cs="Arial"/>
+          <w:sz w:val="20"/>
+          <w:szCs w:val="20"/>
+        </w:rPr>
+        <w:t>i</w:t>
+      </w:r>
+      <w:r>
+        <w:rPr>
+          <w:rFonts w:ascii="Garamond" w:hAnsi="Garamond" w:cs="Arial"/>
+          <w:sz w:val="20"/>
+          <w:szCs w:val="20"/>
+        </w:rPr>
+        <w:t>mpact</w:t>
+      </w:r>
+      <w:r>
+        <w:rPr>
+          <w:rFonts w:ascii="Garamond" w:hAnsi="Garamond" w:cs="Arial"/>
+          <w:sz w:val="20"/>
+          <w:szCs w:val="20"/>
+        </w:rPr>
+        <w:t xml:space="preserve"> for approximately </w:t>
+      </w:r>
+      <w:r>
+        <w:rPr>
+          <w:rFonts w:ascii="Garamond" w:hAnsi="Garamond" w:cs="Arial"/>
+          <w:sz w:val="20"/>
+          <w:szCs w:val="20"/>
+        </w:rPr>
+        <w:t>$210M</w:t>
+      </w:r>
+      <w:r>
+        <w:rPr>
+          <w:rFonts w:ascii="Garamond" w:hAnsi="Garamond" w:cs="Arial"/>
+          <w:sz w:val="20"/>
+          <w:szCs w:val="20"/>
+        </w:rPr>
+        <w:t xml:space="preserve"> in inventory that improved variance tracking and issue resolution, uncovered more than </w:t>
+      </w:r>
+      <w:r>
+        <w:rPr>
+          <w:rFonts w:ascii="Garamond" w:hAnsi="Garamond" w:cs="Arial"/>
+          <w:sz w:val="20"/>
+          <w:szCs w:val="20"/>
+        </w:rPr>
+        <w:t>$225k</w:t>
+      </w:r>
+      <w:r>
+        <w:rPr>
+          <w:rFonts w:ascii="Garamond" w:hAnsi="Garamond" w:cs="Arial"/>
+          <w:sz w:val="20"/>
+          <w:szCs w:val="20"/>
+        </w:rPr>
+        <w:t xml:space="preserve"> in unclaimed rebates annually,</w:t>
       </w:r>
       <w:r>
         <w:rPr>
@@ -5678,23 +5362,128 @@
           <w:sz w:val="20"/>
           <w:szCs w:val="20"/>
         </w:rPr>
-        <w:t>from the</w:t>
-      </w:r>
-      <w:r>
-        <w:rPr>
-          <w:rFonts w:ascii="Garamond" w:hAnsi="Garamond" w:cs="Arial"/>
-          <w:sz w:val="20"/>
-          <w:szCs w:val="20"/>
-        </w:rPr>
-        <w:t xml:space="preserve"> Eclipse ERP Enterprise Data Warehouse </w:t>
-      </w:r>
-      <w:r>
-        <w:rPr>
-          <w:rFonts w:ascii="Garamond" w:hAnsi="Garamond" w:cs="Arial"/>
-          <w:sz w:val="20"/>
-          <w:szCs w:val="20"/>
-        </w:rPr>
-        <w:t>in Power BI, using SSMS and SQL to design BAQs and reusable views that aligned metrics with expected outcomes and decision making needs.</w:t>
+        <w:t xml:space="preserve">exposed </w:t>
+      </w:r>
+      <w:r>
+        <w:rPr>
+          <w:rFonts w:ascii="Garamond" w:hAnsi="Garamond" w:cs="Arial"/>
+          <w:sz w:val="20"/>
+          <w:szCs w:val="20"/>
+        </w:rPr>
+        <w:t xml:space="preserve">and developed </w:t>
+      </w:r>
+      <w:r>
+        <w:rPr>
+          <w:rFonts w:ascii="Garamond" w:hAnsi="Garamond" w:cs="Arial"/>
+          <w:sz w:val="20"/>
+          <w:szCs w:val="20"/>
+        </w:rPr>
+        <w:t xml:space="preserve">improvement strategy for </w:t>
+      </w:r>
+      <w:r>
+        <w:rPr>
+          <w:rFonts w:ascii="Garamond" w:hAnsi="Garamond" w:cs="Arial"/>
+          <w:sz w:val="20"/>
+          <w:szCs w:val="20"/>
+        </w:rPr>
+        <w:t>process gaps that were driving general ledger leakage.</w:t>
+      </w:r>
+    </w:p>
+    <w:p>
+      <w:pPr>
+        <w:pStyle w:val="Heading2"/>
+        <w:rPr>
+          <w:rFonts w:ascii="Garamond" w:hAnsi="Garamond" w:cs="Arial"/>
+          <w:color w:val="1F497D" w:themeColor="text2"/>
+        </w:rPr>
+      </w:pPr>
+      <w:r>
+        <w:rPr>
+          <w:rFonts w:ascii="Garamond" w:hAnsi="Garamond" w:cs="Arial"/>
+          <w:color w:val="1F497D" w:themeColor="text2"/>
+        </w:rPr>
+        <w:t xml:space="preserve">Business Process Analyst </w:t>
+      </w:r>
+      <w:r>
+        <w:rPr>
+          <w:rFonts w:ascii="Garamond" w:hAnsi="Garamond" w:cs="Arial"/>
+          <w:color w:val="1F497D" w:themeColor="text2"/>
+        </w:rPr>
+        <w:t xml:space="preserve"> </w:t>
+      </w:r>
+      <w:r>
+        <w:rPr>
+          <w:rFonts w:ascii="Garamond" w:hAnsi="Garamond" w:cs="Arial"/>
+          <w:color w:val="1F497D" w:themeColor="text2"/>
+        </w:rPr>
+        <w:t xml:space="preserve"> </w:t>
+      </w:r>
+      <w:r>
+        <w:rPr>
+          <w:rFonts w:ascii="Garamond" w:hAnsi="Garamond" w:cs="Arial"/>
+          <w:color w:val="1F497D" w:themeColor="text2"/>
+        </w:rPr>
+        <w:t>Sonepar</w:t>
+      </w:r>
+      <w:r>
+        <w:rPr>
+          <w:rFonts w:ascii="Garamond" w:hAnsi="Garamond" w:cs="Arial"/>
+          <w:color w:val="1F497D" w:themeColor="text2"/>
+        </w:rPr>
+        <w:t>-VES</w:t>
+      </w:r>
+      <w:r>
+        <w:rPr>
+          <w:rFonts w:ascii="Garamond" w:hAnsi="Garamond" w:cs="Arial"/>
+          <w:color w:val="1F497D" w:themeColor="text2"/>
+        </w:rPr>
+        <w:t xml:space="preserve"> </w:t>
+      </w:r>
+      <w:r>
+        <w:rPr>
+          <w:rFonts w:ascii="Garamond" w:hAnsi="Garamond" w:cs="Arial"/>
+          <w:color w:val="1F497D" w:themeColor="text2"/>
+          <w:sz w:val="16"/>
+          <w:szCs w:val="16"/>
+        </w:rPr>
+        <w:t xml:space="preserve">– </w:t>
+      </w:r>
+      <w:r>
+        <w:rPr>
+          <w:rFonts w:ascii="Garamond" w:hAnsi="Garamond" w:cs="Arial"/>
+          <w:color w:val="1F497D" w:themeColor="text2"/>
+          <w:sz w:val="16"/>
+          <w:szCs w:val="16"/>
+        </w:rPr>
+        <w:t>Minneapolis</w:t>
+      </w:r>
+      <w:r>
+        <w:rPr>
+          <w:rFonts w:ascii="Garamond" w:hAnsi="Garamond" w:cs="Arial"/>
+          <w:color w:val="1F497D" w:themeColor="text2"/>
+          <w:sz w:val="16"/>
+          <w:szCs w:val="16"/>
+        </w:rPr>
+        <w:t>, MN</w:t>
+      </w:r>
+    </w:p>
+    <w:p>
+      <w:pPr>
+        <w:rPr>
+          <w:rFonts w:ascii="Garamond" w:hAnsi="Garamond" w:cs="Arial"/>
+          <w:b/>
+          <w:bCs/>
+          <w:color w:val="1F497D" w:themeColor="text2"/>
+        </w:rPr>
+      </w:pPr>
+      <w:r>
+        <w:rPr>
+          <w:rFonts w:ascii="Garamond" w:hAnsi="Garamond" w:cs="Arial"/>
+          <w:b/>
+          <w:bCs/>
+          <w:color w:val="1F497D" w:themeColor="text2"/>
+        </w:rPr>
+        <w:t>May 2017 – Nov 2020</w:t>
       </w:r>
     </w:p>
     <w:p>
@@ -5712,23 +5501,119 @@
           <w:szCs w:val="20"/>
         </w:rPr>
       </w:pPr>
-      <w:proofErr w:type="spellStart"/>
-      <w:r>
-        <w:rPr>
-          <w:rFonts w:ascii="Garamond" w:hAnsi="Garamond" w:cs="Arial"/>
-          <w:b/>
-          <w:bCs/>
-          <w:sz w:val="20"/>
-          <w:szCs w:val="20"/>
-        </w:rPr>
-        <w:t>Led</w:t>
-      </w:r>
-      <w:proofErr w:type="spellEnd"/>
-      <w:r>
-        <w:rPr>
-          <w:rFonts w:ascii="Garamond" w:hAnsi="Garamond" w:cs="Arial"/>
-          <w:b/>
-          <w:bCs/>
+      <w:r>
+        <w:rPr>
+          <w:rFonts w:ascii="Garamond" w:hAnsi="Garamond" w:cs="Arial"/>
+          <w:b/>
+          <w:bCs/>
+          <w:sz w:val="20"/>
+          <w:szCs w:val="20"/>
+        </w:rPr>
+        <w:t xml:space="preserve">Collaborated with </w:t>
+      </w:r>
+      <w:r>
+        <w:rPr>
+          <w:rFonts w:ascii="Garamond" w:hAnsi="Garamond" w:cs="Arial"/>
+          <w:b/>
+          <w:bCs/>
+          <w:sz w:val="20"/>
+          <w:szCs w:val="20"/>
+        </w:rPr>
+        <w:t>B</w:t>
+      </w:r>
+      <w:r>
+        <w:rPr>
+          <w:rFonts w:ascii="Garamond" w:hAnsi="Garamond" w:cs="Arial"/>
+          <w:b/>
+          <w:bCs/>
+          <w:sz w:val="20"/>
+          <w:szCs w:val="20"/>
+        </w:rPr>
+        <w:t xml:space="preserve">usiness </w:t>
+      </w:r>
+      <w:r>
+        <w:rPr>
+          <w:rFonts w:ascii="Garamond" w:hAnsi="Garamond" w:cs="Arial"/>
+          <w:b/>
+          <w:bCs/>
+          <w:sz w:val="20"/>
+          <w:szCs w:val="20"/>
+        </w:rPr>
+        <w:t>L</w:t>
+      </w:r>
+      <w:r>
+        <w:rPr>
+          <w:rFonts w:ascii="Garamond" w:hAnsi="Garamond" w:cs="Arial"/>
+          <w:b/>
+          <w:bCs/>
+          <w:sz w:val="20"/>
+          <w:szCs w:val="20"/>
+        </w:rPr>
+        <w:t xml:space="preserve">eaders to </w:t>
+      </w:r>
+      <w:r>
+        <w:rPr>
+          <w:rFonts w:ascii="Garamond" w:hAnsi="Garamond" w:cs="Arial"/>
+          <w:b/>
+          <w:bCs/>
+          <w:sz w:val="20"/>
+          <w:szCs w:val="20"/>
+        </w:rPr>
+        <w:t>D</w:t>
+      </w:r>
+      <w:r>
+        <w:rPr>
+          <w:rFonts w:ascii="Garamond" w:hAnsi="Garamond" w:cs="Arial"/>
+          <w:b/>
+          <w:bCs/>
+          <w:sz w:val="20"/>
+          <w:szCs w:val="20"/>
+        </w:rPr>
+        <w:t xml:space="preserve">efine KPI </w:t>
+      </w:r>
+      <w:r>
+        <w:rPr>
+          <w:rFonts w:ascii="Garamond" w:hAnsi="Garamond" w:cs="Arial"/>
+          <w:b/>
+          <w:bCs/>
+          <w:sz w:val="20"/>
+          <w:szCs w:val="20"/>
+        </w:rPr>
+        <w:t>D</w:t>
+      </w:r>
+      <w:r>
+        <w:rPr>
+          <w:rFonts w:ascii="Garamond" w:hAnsi="Garamond" w:cs="Arial"/>
+          <w:b/>
+          <w:bCs/>
+          <w:sz w:val="20"/>
+          <w:szCs w:val="20"/>
+        </w:rPr>
+        <w:t xml:space="preserve">riven </w:t>
+      </w:r>
+      <w:r>
+        <w:rPr>
+          <w:rFonts w:ascii="Garamond" w:hAnsi="Garamond" w:cs="Arial"/>
+          <w:b/>
+          <w:bCs/>
+          <w:sz w:val="20"/>
+          <w:szCs w:val="20"/>
+        </w:rPr>
+        <w:t>R</w:t>
+      </w:r>
+      <w:r>
+        <w:rPr>
+          <w:rFonts w:ascii="Garamond" w:hAnsi="Garamond" w:cs="Arial"/>
+          <w:b/>
+          <w:bCs/>
+          <w:sz w:val="20"/>
+          <w:szCs w:val="20"/>
+        </w:rPr>
+        <w:t>eporting</w:t>
+      </w:r>
+      <w:r>
+        <w:rPr>
+          <w:rFonts w:ascii="Garamond" w:hAnsi="Garamond" w:cs="Arial"/>
           <w:sz w:val="20"/>
           <w:szCs w:val="20"/>
         </w:rPr>
@@ -5737,150 +5622,26 @@
       <w:r>
         <w:rPr>
           <w:rFonts w:ascii="Garamond" w:hAnsi="Garamond" w:cs="Arial"/>
-          <w:b/>
-          <w:bCs/>
-          <w:sz w:val="20"/>
-          <w:szCs w:val="20"/>
-        </w:rPr>
-        <w:t>C</w:t>
-      </w:r>
-      <w:r>
-        <w:rPr>
-          <w:rFonts w:ascii="Garamond" w:hAnsi="Garamond" w:cs="Arial"/>
-          <w:b/>
-          <w:bCs/>
-          <w:sz w:val="20"/>
-          <w:szCs w:val="20"/>
-        </w:rPr>
-        <w:t xml:space="preserve">ross </w:t>
-      </w:r>
-      <w:r>
-        <w:rPr>
-          <w:rFonts w:ascii="Garamond" w:hAnsi="Garamond" w:cs="Arial"/>
-          <w:b/>
-          <w:bCs/>
-          <w:sz w:val="20"/>
-          <w:szCs w:val="20"/>
-        </w:rPr>
-        <w:t>F</w:t>
-      </w:r>
-      <w:r>
-        <w:rPr>
-          <w:rFonts w:ascii="Garamond" w:hAnsi="Garamond" w:cs="Arial"/>
-          <w:b/>
-          <w:bCs/>
-          <w:sz w:val="20"/>
-          <w:szCs w:val="20"/>
-        </w:rPr>
-        <w:t xml:space="preserve">unctional </w:t>
-      </w:r>
-      <w:r>
-        <w:rPr>
-          <w:rFonts w:ascii="Garamond" w:hAnsi="Garamond" w:cs="Arial"/>
-          <w:b/>
-          <w:bCs/>
-          <w:sz w:val="20"/>
-          <w:szCs w:val="20"/>
-        </w:rPr>
-        <w:t>I</w:t>
-      </w:r>
-      <w:r>
-        <w:rPr>
-          <w:rFonts w:ascii="Garamond" w:hAnsi="Garamond" w:cs="Arial"/>
-          <w:b/>
-          <w:bCs/>
-          <w:sz w:val="20"/>
-          <w:szCs w:val="20"/>
-        </w:rPr>
-        <w:t xml:space="preserve">mplementation </w:t>
-      </w:r>
-      <w:r>
-        <w:rPr>
-          <w:rFonts w:ascii="Garamond" w:hAnsi="Garamond" w:cs="Arial"/>
-          <w:b/>
-          <w:bCs/>
-          <w:sz w:val="20"/>
-          <w:szCs w:val="20"/>
-        </w:rPr>
-        <w:t>Teams</w:t>
-      </w:r>
-      <w:r>
-        <w:rPr>
-          <w:rFonts w:ascii="Garamond" w:hAnsi="Garamond" w:cs="Arial"/>
-          <w:b/>
-          <w:bCs/>
-          <w:sz w:val="20"/>
-          <w:szCs w:val="20"/>
-        </w:rPr>
-        <w:t xml:space="preserve"> </w:t>
-      </w:r>
-      <w:r>
-        <w:rPr>
-          <w:rFonts w:ascii="Garamond" w:hAnsi="Garamond" w:cs="Arial"/>
-          <w:b/>
-          <w:bCs/>
-          <w:sz w:val="20"/>
-          <w:szCs w:val="20"/>
-        </w:rPr>
-        <w:t>A</w:t>
-      </w:r>
-      <w:r>
-        <w:rPr>
-          <w:rFonts w:ascii="Garamond" w:hAnsi="Garamond" w:cs="Arial"/>
-          <w:b/>
-          <w:bCs/>
-          <w:sz w:val="20"/>
-          <w:szCs w:val="20"/>
-        </w:rPr>
-        <w:t xml:space="preserve">cross </w:t>
-      </w:r>
-      <w:r>
-        <w:rPr>
-          <w:rFonts w:ascii="Garamond" w:hAnsi="Garamond" w:cs="Arial"/>
-          <w:b/>
-          <w:bCs/>
-          <w:sz w:val="20"/>
-          <w:szCs w:val="20"/>
-        </w:rPr>
-        <w:t>D</w:t>
-      </w:r>
-      <w:r>
-        <w:rPr>
-          <w:rFonts w:ascii="Garamond" w:hAnsi="Garamond" w:cs="Arial"/>
-          <w:b/>
-          <w:bCs/>
-          <w:sz w:val="20"/>
-          <w:szCs w:val="20"/>
-        </w:rPr>
-        <w:t xml:space="preserve">istribution </w:t>
-      </w:r>
-      <w:r>
-        <w:rPr>
-          <w:rFonts w:ascii="Garamond" w:hAnsi="Garamond" w:cs="Arial"/>
-          <w:b/>
-          <w:bCs/>
-          <w:sz w:val="20"/>
-          <w:szCs w:val="20"/>
-        </w:rPr>
-        <w:t>C</w:t>
-      </w:r>
-      <w:r>
-        <w:rPr>
-          <w:rFonts w:ascii="Garamond" w:hAnsi="Garamond" w:cs="Arial"/>
-          <w:b/>
-          <w:bCs/>
-          <w:sz w:val="20"/>
-          <w:szCs w:val="20"/>
-        </w:rPr>
-        <w:t>enters</w:t>
-      </w:r>
-      <w:r>
-        <w:rPr>
-          <w:rFonts w:ascii="Garamond" w:hAnsi="Garamond" w:cs="Arial"/>
-          <w:sz w:val="20"/>
-          <w:szCs w:val="20"/>
-        </w:rPr>
-        <w:t xml:space="preserve"> including two central RF conversions with a combined budget of one point five million and several regional conversions, applying SQL and Eclipse data to build</w:t>
+          <w:sz w:val="20"/>
+          <w:szCs w:val="20"/>
+        </w:rPr>
+        <w:t>from the</w:t>
+      </w:r>
+      <w:r>
+        <w:rPr>
+          <w:rFonts w:ascii="Garamond" w:hAnsi="Garamond" w:cs="Arial"/>
+          <w:sz w:val="20"/>
+          <w:szCs w:val="20"/>
+        </w:rPr>
+        <w:t xml:space="preserve"> Eclipse ERP Enterprise Data Warehouse </w:t>
+      </w:r>
+      <w:r>
+        <w:rPr>
+          <w:rFonts w:ascii="Garamond" w:hAnsi="Garamond" w:cs="Arial"/>
+          <w:sz w:val="20"/>
+          <w:szCs w:val="20"/>
+        </w:rPr>
+        <w:t>in Power BI, using SSMS and SQL to design BAQs and reusable views that aligned metrics with expected outcomes and decision making needs.</w:t>
       </w:r>
     </w:p>
     <w:p>
@@ -5898,55 +5659,127 @@
           <w:szCs w:val="20"/>
         </w:rPr>
       </w:pPr>
-      <w:r>
-        <w:rPr>
-          <w:rFonts w:ascii="Garamond" w:hAnsi="Garamond" w:cs="Arial"/>
-          <w:b/>
-          <w:bCs/>
-          <w:sz w:val="20"/>
-          <w:szCs w:val="20"/>
-        </w:rPr>
-        <w:t xml:space="preserve">Instrumented </w:t>
-      </w:r>
-      <w:r>
-        <w:rPr>
-          <w:rFonts w:ascii="Garamond" w:hAnsi="Garamond" w:cs="Arial"/>
-          <w:b/>
-          <w:bCs/>
-          <w:sz w:val="20"/>
-          <w:szCs w:val="20"/>
-        </w:rPr>
-        <w:t>R</w:t>
-      </w:r>
-      <w:r>
-        <w:rPr>
-          <w:rFonts w:ascii="Garamond" w:hAnsi="Garamond" w:cs="Arial"/>
-          <w:b/>
-          <w:bCs/>
-          <w:sz w:val="20"/>
-          <w:szCs w:val="20"/>
-        </w:rPr>
-        <w:t xml:space="preserve">ollout </w:t>
-      </w:r>
-      <w:r>
-        <w:rPr>
-          <w:rFonts w:ascii="Garamond" w:hAnsi="Garamond" w:cs="Arial"/>
-          <w:b/>
-          <w:bCs/>
-          <w:sz w:val="20"/>
-          <w:szCs w:val="20"/>
-        </w:rPr>
-        <w:t>P</w:t>
-      </w:r>
-      <w:r>
-        <w:rPr>
-          <w:rFonts w:ascii="Garamond" w:hAnsi="Garamond" w:cs="Arial"/>
-          <w:b/>
-          <w:bCs/>
-          <w:sz w:val="20"/>
-          <w:szCs w:val="20"/>
-        </w:rPr>
-        <w:t xml:space="preserve">rograms with </w:t>
+      <w:proofErr w:type="spellStart"/>
+      <w:r>
+        <w:rPr>
+          <w:rFonts w:ascii="Garamond" w:hAnsi="Garamond" w:cs="Arial"/>
+          <w:b/>
+          <w:bCs/>
+          <w:sz w:val="20"/>
+          <w:szCs w:val="20"/>
+        </w:rPr>
+        <w:t>Led</w:t>
+      </w:r>
+      <w:proofErr w:type="spellEnd"/>
+      <w:r>
+        <w:rPr>
+          <w:rFonts w:ascii="Garamond" w:hAnsi="Garamond" w:cs="Arial"/>
+          <w:b/>
+          <w:bCs/>
+          <w:sz w:val="20"/>
+          <w:szCs w:val="20"/>
+        </w:rPr>
+        <w:t xml:space="preserve"> </w:t>
+      </w:r>
+      <w:r>
+        <w:rPr>
+          <w:rFonts w:ascii="Garamond" w:hAnsi="Garamond" w:cs="Arial"/>
+          <w:b/>
+          <w:bCs/>
+          <w:sz w:val="20"/>
+          <w:szCs w:val="20"/>
+        </w:rPr>
+        <w:t>C</w:t>
+      </w:r>
+      <w:r>
+        <w:rPr>
+          <w:rFonts w:ascii="Garamond" w:hAnsi="Garamond" w:cs="Arial"/>
+          <w:b/>
+          <w:bCs/>
+          <w:sz w:val="20"/>
+          <w:szCs w:val="20"/>
+        </w:rPr>
+        <w:t xml:space="preserve">ross </w:t>
+      </w:r>
+      <w:r>
+        <w:rPr>
+          <w:rFonts w:ascii="Garamond" w:hAnsi="Garamond" w:cs="Arial"/>
+          <w:b/>
+          <w:bCs/>
+          <w:sz w:val="20"/>
+          <w:szCs w:val="20"/>
+        </w:rPr>
+        <w:t>F</w:t>
+      </w:r>
+      <w:r>
+        <w:rPr>
+          <w:rFonts w:ascii="Garamond" w:hAnsi="Garamond" w:cs="Arial"/>
+          <w:b/>
+          <w:bCs/>
+          <w:sz w:val="20"/>
+          <w:szCs w:val="20"/>
+        </w:rPr>
+        <w:t xml:space="preserve">unctional </w:t>
+      </w:r>
+      <w:r>
+        <w:rPr>
+          <w:rFonts w:ascii="Garamond" w:hAnsi="Garamond" w:cs="Arial"/>
+          <w:b/>
+          <w:bCs/>
+          <w:sz w:val="20"/>
+          <w:szCs w:val="20"/>
+        </w:rPr>
+        <w:t>I</w:t>
+      </w:r>
+      <w:r>
+        <w:rPr>
+          <w:rFonts w:ascii="Garamond" w:hAnsi="Garamond" w:cs="Arial"/>
+          <w:b/>
+          <w:bCs/>
+          <w:sz w:val="20"/>
+          <w:szCs w:val="20"/>
+        </w:rPr>
+        <w:t xml:space="preserve">mplementation </w:t>
+      </w:r>
+      <w:r>
+        <w:rPr>
+          <w:rFonts w:ascii="Garamond" w:hAnsi="Garamond" w:cs="Arial"/>
+          <w:b/>
+          <w:bCs/>
+          <w:sz w:val="20"/>
+          <w:szCs w:val="20"/>
+        </w:rPr>
+        <w:t>Teams</w:t>
+      </w:r>
+      <w:r>
+        <w:rPr>
+          <w:rFonts w:ascii="Garamond" w:hAnsi="Garamond" w:cs="Arial"/>
+          <w:b/>
+          <w:bCs/>
+          <w:sz w:val="20"/>
+          <w:szCs w:val="20"/>
+        </w:rPr>
+        <w:t xml:space="preserve"> </w:t>
+      </w:r>
+      <w:r>
+        <w:rPr>
+          <w:rFonts w:ascii="Garamond" w:hAnsi="Garamond" w:cs="Arial"/>
+          <w:b/>
+          <w:bCs/>
+          <w:sz w:val="20"/>
+          <w:szCs w:val="20"/>
+        </w:rPr>
+        <w:t>A</w:t>
+      </w:r>
+      <w:r>
+        <w:rPr>
+          <w:rFonts w:ascii="Garamond" w:hAnsi="Garamond" w:cs="Arial"/>
+          <w:b/>
+          <w:bCs/>
+          <w:sz w:val="20"/>
+          <w:szCs w:val="20"/>
+        </w:rPr>
+        <w:t xml:space="preserve">cross </w:t>
       </w:r>
       <w:r>
         <w:rPr>
@@ -5966,47 +5799,7 @@
           <w:sz w:val="20"/>
           <w:szCs w:val="20"/>
         </w:rPr>
-        <w:t xml:space="preserve">ata </w:t>
-      </w:r>
-      <w:r>
-        <w:rPr>
-          <w:rFonts w:ascii="Garamond" w:hAnsi="Garamond" w:cs="Arial"/>
-          <w:b/>
-          <w:bCs/>
-          <w:sz w:val="20"/>
-          <w:szCs w:val="20"/>
-        </w:rPr>
-        <w:t>P</w:t>
-      </w:r>
-      <w:r>
-        <w:rPr>
-          <w:rFonts w:ascii="Garamond" w:hAnsi="Garamond" w:cs="Arial"/>
-          <w:b/>
-          <w:bCs/>
-          <w:sz w:val="20"/>
-          <w:szCs w:val="20"/>
-        </w:rPr>
-        <w:t xml:space="preserve">ipelines and </w:t>
-      </w:r>
-      <w:r>
-        <w:rPr>
-          <w:rFonts w:ascii="Garamond" w:hAnsi="Garamond" w:cs="Arial"/>
-          <w:b/>
-          <w:bCs/>
-          <w:sz w:val="20"/>
-          <w:szCs w:val="20"/>
-        </w:rPr>
-        <w:t>V</w:t>
-      </w:r>
-      <w:r>
-        <w:rPr>
-          <w:rFonts w:ascii="Garamond" w:hAnsi="Garamond" w:cs="Arial"/>
-          <w:b/>
-          <w:bCs/>
-          <w:sz w:val="20"/>
-          <w:szCs w:val="20"/>
-        </w:rPr>
-        <w:t xml:space="preserve">alidation </w:t>
+        <w:t xml:space="preserve">istribution </w:t>
       </w:r>
       <w:r>
         <w:rPr>
@@ -6026,15 +5819,15 @@
           <w:sz w:val="20"/>
           <w:szCs w:val="20"/>
         </w:rPr>
-        <w:t>hecks</w:t>
-      </w:r>
-      <w:r>
-        <w:rPr>
-          <w:rFonts w:ascii="Garamond" w:hAnsi="Garamond" w:cs="Arial"/>
-          <w:sz w:val="20"/>
-          <w:szCs w:val="20"/>
-        </w:rPr>
-        <w:t xml:space="preserve"> to support RF conversions, cycle counting, and routing, enabling accurate cutover readiness, measurable adoption across locations, and consistent data quality standards.</w:t>
+        <w:t>enters</w:t>
+      </w:r>
+      <w:r>
+        <w:rPr>
+          <w:rFonts w:ascii="Garamond" w:hAnsi="Garamond" w:cs="Arial"/>
+          <w:sz w:val="20"/>
+          <w:szCs w:val="20"/>
+        </w:rPr>
+        <w:t xml:space="preserve"> including two central RF conversions with a combined budget of one point five million and several regional conversions, applying SQL and Eclipse data to build</w:t>
       </w:r>
     </w:p>
     <w:p>
@@ -6060,27 +5853,27 @@
           <w:sz w:val="20"/>
           <w:szCs w:val="20"/>
         </w:rPr>
-        <w:t xml:space="preserve">Delivered </w:t>
-      </w:r>
-      <w:r>
-        <w:rPr>
-          <w:rFonts w:ascii="Garamond" w:hAnsi="Garamond" w:cs="Arial"/>
-          <w:b/>
-          <w:bCs/>
-          <w:sz w:val="20"/>
-          <w:szCs w:val="20"/>
-        </w:rPr>
-        <w:t>W</w:t>
-      </w:r>
-      <w:r>
-        <w:rPr>
-          <w:rFonts w:ascii="Garamond" w:hAnsi="Garamond" w:cs="Arial"/>
-          <w:b/>
-          <w:bCs/>
-          <w:sz w:val="20"/>
-          <w:szCs w:val="20"/>
-        </w:rPr>
-        <w:t xml:space="preserve">orkforce </w:t>
+        <w:t xml:space="preserve">Instrumented </w:t>
+      </w:r>
+      <w:r>
+        <w:rPr>
+          <w:rFonts w:ascii="Garamond" w:hAnsi="Garamond" w:cs="Arial"/>
+          <w:b/>
+          <w:bCs/>
+          <w:sz w:val="20"/>
+          <w:szCs w:val="20"/>
+        </w:rPr>
+        <w:t>R</w:t>
+      </w:r>
+      <w:r>
+        <w:rPr>
+          <w:rFonts w:ascii="Garamond" w:hAnsi="Garamond" w:cs="Arial"/>
+          <w:b/>
+          <w:bCs/>
+          <w:sz w:val="20"/>
+          <w:szCs w:val="20"/>
+        </w:rPr>
+        <w:t xml:space="preserve">ollout </w:t>
       </w:r>
       <w:r>
         <w:rPr>
@@ -6100,27 +5893,7 @@
           <w:sz w:val="20"/>
           <w:szCs w:val="20"/>
         </w:rPr>
-        <w:t xml:space="preserve">lanning </w:t>
-      </w:r>
-      <w:r>
-        <w:rPr>
-          <w:rFonts w:ascii="Garamond" w:hAnsi="Garamond" w:cs="Arial"/>
-          <w:b/>
-          <w:bCs/>
-          <w:sz w:val="20"/>
-          <w:szCs w:val="20"/>
-        </w:rPr>
-        <w:t>M</w:t>
-      </w:r>
-      <w:r>
-        <w:rPr>
-          <w:rFonts w:ascii="Garamond" w:hAnsi="Garamond" w:cs="Arial"/>
-          <w:b/>
-          <w:bCs/>
-          <w:sz w:val="20"/>
-          <w:szCs w:val="20"/>
-        </w:rPr>
-        <w:t xml:space="preserve">odels and </w:t>
+        <w:t xml:space="preserve">rograms with </w:t>
       </w:r>
       <w:r>
         <w:rPr>
@@ -6140,67 +5913,7 @@
           <w:sz w:val="20"/>
           <w:szCs w:val="20"/>
         </w:rPr>
-        <w:t xml:space="preserve">ashboards for the </w:t>
-      </w:r>
-      <w:r>
-        <w:rPr>
-          <w:rFonts w:ascii="Garamond" w:hAnsi="Garamond" w:cs="Arial"/>
-          <w:b/>
-          <w:bCs/>
-          <w:sz w:val="20"/>
-          <w:szCs w:val="20"/>
-        </w:rPr>
-        <w:t>E</w:t>
-      </w:r>
-      <w:r>
-        <w:rPr>
-          <w:rFonts w:ascii="Garamond" w:hAnsi="Garamond" w:cs="Arial"/>
-          <w:b/>
-          <w:bCs/>
-          <w:sz w:val="20"/>
-          <w:szCs w:val="20"/>
-        </w:rPr>
-        <w:t xml:space="preserve">xecutive </w:t>
-      </w:r>
-      <w:r>
-        <w:rPr>
-          <w:rFonts w:ascii="Garamond" w:hAnsi="Garamond" w:cs="Arial"/>
-          <w:b/>
-          <w:bCs/>
-          <w:sz w:val="20"/>
-          <w:szCs w:val="20"/>
-        </w:rPr>
-        <w:t>T</w:t>
-      </w:r>
-      <w:r>
-        <w:rPr>
-          <w:rFonts w:ascii="Garamond" w:hAnsi="Garamond" w:cs="Arial"/>
-          <w:b/>
-          <w:bCs/>
-          <w:sz w:val="20"/>
-          <w:szCs w:val="20"/>
-        </w:rPr>
-        <w:t xml:space="preserve">eam </w:t>
-      </w:r>
-      <w:r>
-        <w:rPr>
-          <w:rFonts w:ascii="Garamond" w:hAnsi="Garamond" w:cs="Arial"/>
-          <w:b/>
-          <w:bCs/>
-          <w:sz w:val="20"/>
-          <w:szCs w:val="20"/>
-        </w:rPr>
-        <w:t>D</w:t>
-      </w:r>
-      <w:r>
-        <w:rPr>
-          <w:rFonts w:ascii="Garamond" w:hAnsi="Garamond" w:cs="Arial"/>
-          <w:b/>
-          <w:bCs/>
-          <w:sz w:val="20"/>
-          <w:szCs w:val="20"/>
-        </w:rPr>
-        <w:t xml:space="preserve">uring the COVID </w:t>
+        <w:t xml:space="preserve">ata </w:t>
       </w:r>
       <w:r>
         <w:rPr>
@@ -6220,87 +5933,55 @@
           <w:sz w:val="20"/>
           <w:szCs w:val="20"/>
         </w:rPr>
-        <w:t>andemic</w:t>
-      </w:r>
-      <w:r>
-        <w:rPr>
-          <w:rFonts w:ascii="Garamond" w:hAnsi="Garamond" w:cs="Arial"/>
-          <w:sz w:val="20"/>
-          <w:szCs w:val="20"/>
-        </w:rPr>
-        <w:t xml:space="preserve"> integrating HR and Operations data </w:t>
-      </w:r>
-      <w:r>
-        <w:rPr>
-          <w:rFonts w:ascii="Garamond" w:hAnsi="Garamond" w:cs="Arial"/>
-          <w:sz w:val="20"/>
-          <w:szCs w:val="20"/>
-        </w:rPr>
-        <w:t xml:space="preserve">into Power BI </w:t>
-      </w:r>
-      <w:r>
-        <w:rPr>
-          <w:rFonts w:ascii="Garamond" w:hAnsi="Garamond" w:cs="Arial"/>
-          <w:sz w:val="20"/>
-          <w:szCs w:val="20"/>
-        </w:rPr>
-        <w:t>to measure true productivity and inform real time staffing decisions</w:t>
-      </w:r>
-      <w:r>
-        <w:rPr>
-          <w:rFonts w:ascii="Garamond" w:hAnsi="Garamond" w:cs="Arial"/>
-          <w:sz w:val="20"/>
-          <w:szCs w:val="20"/>
-        </w:rPr>
-        <w:t xml:space="preserve"> on where and how to make</w:t>
-      </w:r>
-      <w:r>
-        <w:rPr>
-          <w:rFonts w:ascii="Garamond" w:hAnsi="Garamond" w:cs="Arial"/>
-          <w:sz w:val="20"/>
-          <w:szCs w:val="20"/>
-        </w:rPr>
-        <w:t xml:space="preserve"> hour reductions</w:t>
-      </w:r>
-      <w:r>
-        <w:rPr>
-          <w:rFonts w:ascii="Garamond" w:hAnsi="Garamond" w:cs="Arial"/>
-          <w:sz w:val="20"/>
-          <w:szCs w:val="20"/>
-        </w:rPr>
-        <w:t xml:space="preserve">, resulting in no </w:t>
-      </w:r>
-      <w:r>
-        <w:rPr>
-          <w:rFonts w:ascii="Garamond" w:hAnsi="Garamond" w:cs="Arial"/>
-          <w:sz w:val="20"/>
-          <w:szCs w:val="20"/>
-        </w:rPr>
-        <w:t xml:space="preserve">layoffs across </w:t>
-      </w:r>
-      <w:r>
-        <w:rPr>
-          <w:rFonts w:ascii="Garamond" w:hAnsi="Garamond" w:cs="Arial"/>
-          <w:sz w:val="20"/>
-          <w:szCs w:val="20"/>
-        </w:rPr>
-        <w:t>twenty four</w:t>
-      </w:r>
-      <w:r>
-        <w:rPr>
-          <w:rFonts w:ascii="Garamond" w:hAnsi="Garamond" w:cs="Arial"/>
-          <w:sz w:val="20"/>
-          <w:szCs w:val="20"/>
-        </w:rPr>
-        <w:t xml:space="preserve"> location</w:t>
-      </w:r>
-      <w:r>
-        <w:rPr>
-          <w:rFonts w:ascii="Garamond" w:hAnsi="Garamond" w:cs="Arial"/>
-          <w:sz w:val="20"/>
-          <w:szCs w:val="20"/>
-        </w:rPr>
-        <w:t xml:space="preserve">s in 2020. </w:t>
+        <w:t xml:space="preserve">ipelines and </w:t>
+      </w:r>
+      <w:r>
+        <w:rPr>
+          <w:rFonts w:ascii="Garamond" w:hAnsi="Garamond" w:cs="Arial"/>
+          <w:b/>
+          <w:bCs/>
+          <w:sz w:val="20"/>
+          <w:szCs w:val="20"/>
+        </w:rPr>
+        <w:t>V</w:t>
+      </w:r>
+      <w:r>
+        <w:rPr>
+          <w:rFonts w:ascii="Garamond" w:hAnsi="Garamond" w:cs="Arial"/>
+          <w:b/>
+          <w:bCs/>
+          <w:sz w:val="20"/>
+          <w:szCs w:val="20"/>
+        </w:rPr>
+        <w:t xml:space="preserve">alidation </w:t>
+      </w:r>
+      <w:r>
+        <w:rPr>
+          <w:rFonts w:ascii="Garamond" w:hAnsi="Garamond" w:cs="Arial"/>
+          <w:b/>
+          <w:bCs/>
+          <w:sz w:val="20"/>
+          <w:szCs w:val="20"/>
+        </w:rPr>
+        <w:t>C</w:t>
+      </w:r>
+      <w:r>
+        <w:rPr>
+          <w:rFonts w:ascii="Garamond" w:hAnsi="Garamond" w:cs="Arial"/>
+          <w:b/>
+          <w:bCs/>
+          <w:sz w:val="20"/>
+          <w:szCs w:val="20"/>
+        </w:rPr>
+        <w:t>hecks</w:t>
+      </w:r>
+      <w:r>
+        <w:rPr>
+          <w:rFonts w:ascii="Garamond" w:hAnsi="Garamond" w:cs="Arial"/>
+          <w:sz w:val="20"/>
+          <w:szCs w:val="20"/>
+        </w:rPr>
+        <w:t xml:space="preserve"> to support RF conversions, cycle counting, and routing, enabling accurate cutover readiness, measurable adoption across locations, and consistent data quality standards.</w:t>
       </w:r>
     </w:p>
     <w:p>
@@ -6326,47 +6007,67 @@
           <w:sz w:val="20"/>
           <w:szCs w:val="20"/>
         </w:rPr>
-        <w:t xml:space="preserve">Authored </w:t>
-      </w:r>
-      <w:r>
-        <w:rPr>
-          <w:rFonts w:ascii="Garamond" w:hAnsi="Garamond" w:cs="Arial"/>
-          <w:b/>
-          <w:bCs/>
-          <w:sz w:val="20"/>
-          <w:szCs w:val="20"/>
-        </w:rPr>
-        <w:t>C</w:t>
-      </w:r>
-      <w:r>
-        <w:rPr>
-          <w:rFonts w:ascii="Garamond" w:hAnsi="Garamond" w:cs="Arial"/>
-          <w:b/>
-          <w:bCs/>
-          <w:sz w:val="20"/>
-          <w:szCs w:val="20"/>
-        </w:rPr>
-        <w:t xml:space="preserve">omprehensive </w:t>
-      </w:r>
-      <w:r>
-        <w:rPr>
-          <w:rFonts w:ascii="Garamond" w:hAnsi="Garamond" w:cs="Arial"/>
-          <w:b/>
-          <w:bCs/>
-          <w:sz w:val="20"/>
-          <w:szCs w:val="20"/>
-        </w:rPr>
-        <w:t>O</w:t>
-      </w:r>
-      <w:r>
-        <w:rPr>
-          <w:rFonts w:ascii="Garamond" w:hAnsi="Garamond" w:cs="Arial"/>
-          <w:b/>
-          <w:bCs/>
-          <w:sz w:val="20"/>
-          <w:szCs w:val="20"/>
-        </w:rPr>
-        <w:t xml:space="preserve">perational </w:t>
+        <w:t xml:space="preserve">Delivered </w:t>
+      </w:r>
+      <w:r>
+        <w:rPr>
+          <w:rFonts w:ascii="Garamond" w:hAnsi="Garamond" w:cs="Arial"/>
+          <w:b/>
+          <w:bCs/>
+          <w:sz w:val="20"/>
+          <w:szCs w:val="20"/>
+        </w:rPr>
+        <w:t>W</w:t>
+      </w:r>
+      <w:r>
+        <w:rPr>
+          <w:rFonts w:ascii="Garamond" w:hAnsi="Garamond" w:cs="Arial"/>
+          <w:b/>
+          <w:bCs/>
+          <w:sz w:val="20"/>
+          <w:szCs w:val="20"/>
+        </w:rPr>
+        <w:t xml:space="preserve">orkforce </w:t>
+      </w:r>
+      <w:r>
+        <w:rPr>
+          <w:rFonts w:ascii="Garamond" w:hAnsi="Garamond" w:cs="Arial"/>
+          <w:b/>
+          <w:bCs/>
+          <w:sz w:val="20"/>
+          <w:szCs w:val="20"/>
+        </w:rPr>
+        <w:t>P</w:t>
+      </w:r>
+      <w:r>
+        <w:rPr>
+          <w:rFonts w:ascii="Garamond" w:hAnsi="Garamond" w:cs="Arial"/>
+          <w:b/>
+          <w:bCs/>
+          <w:sz w:val="20"/>
+          <w:szCs w:val="20"/>
+        </w:rPr>
+        <w:t xml:space="preserve">lanning </w:t>
+      </w:r>
+      <w:r>
+        <w:rPr>
+          <w:rFonts w:ascii="Garamond" w:hAnsi="Garamond" w:cs="Arial"/>
+          <w:b/>
+          <w:bCs/>
+          <w:sz w:val="20"/>
+          <w:szCs w:val="20"/>
+        </w:rPr>
+        <w:t>M</w:t>
+      </w:r>
+      <w:r>
+        <w:rPr>
+          <w:rFonts w:ascii="Garamond" w:hAnsi="Garamond" w:cs="Arial"/>
+          <w:b/>
+          <w:bCs/>
+          <w:sz w:val="20"/>
+          <w:szCs w:val="20"/>
+        </w:rPr>
+        <w:t xml:space="preserve">odels and </w:t>
       </w:r>
       <w:r>
         <w:rPr>
@@ -6386,31 +6087,167 @@
           <w:sz w:val="20"/>
           <w:szCs w:val="20"/>
         </w:rPr>
-        <w:t>ocumentation</w:t>
-      </w:r>
-      <w:r>
-        <w:rPr>
-          <w:rFonts w:ascii="Garamond" w:hAnsi="Garamond" w:cs="Arial"/>
-          <w:sz w:val="20"/>
-          <w:szCs w:val="20"/>
-        </w:rPr>
-        <w:t xml:space="preserve"> including </w:t>
-      </w:r>
-      <w:r>
-        <w:rPr>
-          <w:rFonts w:ascii="Garamond" w:hAnsi="Garamond" w:cs="Arial"/>
-          <w:sz w:val="20"/>
-          <w:szCs w:val="20"/>
-        </w:rPr>
-        <w:t>hundreds of</w:t>
-      </w:r>
-      <w:r>
-        <w:rPr>
-          <w:rFonts w:ascii="Garamond" w:hAnsi="Garamond" w:cs="Arial"/>
-          <w:sz w:val="20"/>
-          <w:szCs w:val="20"/>
-        </w:rPr>
-        <w:t xml:space="preserve"> pages of standard operating procedures, process improvement plans, and process flow diagrams that established clear roles, inputs, outputs, and quality checkpoints.</w:t>
+        <w:t xml:space="preserve">ashboards for the </w:t>
+      </w:r>
+      <w:r>
+        <w:rPr>
+          <w:rFonts w:ascii="Garamond" w:hAnsi="Garamond" w:cs="Arial"/>
+          <w:b/>
+          <w:bCs/>
+          <w:sz w:val="20"/>
+          <w:szCs w:val="20"/>
+        </w:rPr>
+        <w:t>E</w:t>
+      </w:r>
+      <w:r>
+        <w:rPr>
+          <w:rFonts w:ascii="Garamond" w:hAnsi="Garamond" w:cs="Arial"/>
+          <w:b/>
+          <w:bCs/>
+          <w:sz w:val="20"/>
+          <w:szCs w:val="20"/>
+        </w:rPr>
+        <w:t xml:space="preserve">xecutive </w:t>
+      </w:r>
+      <w:r>
+        <w:rPr>
+          <w:rFonts w:ascii="Garamond" w:hAnsi="Garamond" w:cs="Arial"/>
+          <w:b/>
+          <w:bCs/>
+          <w:sz w:val="20"/>
+          <w:szCs w:val="20"/>
+        </w:rPr>
+        <w:t>T</w:t>
+      </w:r>
+      <w:r>
+        <w:rPr>
+          <w:rFonts w:ascii="Garamond" w:hAnsi="Garamond" w:cs="Arial"/>
+          <w:b/>
+          <w:bCs/>
+          <w:sz w:val="20"/>
+          <w:szCs w:val="20"/>
+        </w:rPr>
+        <w:t xml:space="preserve">eam </w:t>
+      </w:r>
+      <w:r>
+        <w:rPr>
+          <w:rFonts w:ascii="Garamond" w:hAnsi="Garamond" w:cs="Arial"/>
+          <w:b/>
+          <w:bCs/>
+          <w:sz w:val="20"/>
+          <w:szCs w:val="20"/>
+        </w:rPr>
+        <w:t>D</w:t>
+      </w:r>
+      <w:r>
+        <w:rPr>
+          <w:rFonts w:ascii="Garamond" w:hAnsi="Garamond" w:cs="Arial"/>
+          <w:b/>
+          <w:bCs/>
+          <w:sz w:val="20"/>
+          <w:szCs w:val="20"/>
+        </w:rPr>
+        <w:t xml:space="preserve">uring the COVID </w:t>
+      </w:r>
+      <w:r>
+        <w:rPr>
+          <w:rFonts w:ascii="Garamond" w:hAnsi="Garamond" w:cs="Arial"/>
+          <w:b/>
+          <w:bCs/>
+          <w:sz w:val="20"/>
+          <w:szCs w:val="20"/>
+        </w:rPr>
+        <w:t>P</w:t>
+      </w:r>
+      <w:r>
+        <w:rPr>
+          <w:rFonts w:ascii="Garamond" w:hAnsi="Garamond" w:cs="Arial"/>
+          <w:b/>
+          <w:bCs/>
+          <w:sz w:val="20"/>
+          <w:szCs w:val="20"/>
+        </w:rPr>
+        <w:t>andemic</w:t>
+      </w:r>
+      <w:r>
+        <w:rPr>
+          <w:rFonts w:ascii="Garamond" w:hAnsi="Garamond" w:cs="Arial"/>
+          <w:sz w:val="20"/>
+          <w:szCs w:val="20"/>
+        </w:rPr>
+        <w:t xml:space="preserve"> integrating HR and Operations data </w:t>
+      </w:r>
+      <w:r>
+        <w:rPr>
+          <w:rFonts w:ascii="Garamond" w:hAnsi="Garamond" w:cs="Arial"/>
+          <w:sz w:val="20"/>
+          <w:szCs w:val="20"/>
+        </w:rPr>
+        <w:t xml:space="preserve">into Power BI </w:t>
+      </w:r>
+      <w:r>
+        <w:rPr>
+          <w:rFonts w:ascii="Garamond" w:hAnsi="Garamond" w:cs="Arial"/>
+          <w:sz w:val="20"/>
+          <w:szCs w:val="20"/>
+        </w:rPr>
+        <w:t>to measure true productivity and inform real time staffing decisions</w:t>
+      </w:r>
+      <w:r>
+        <w:rPr>
+          <w:rFonts w:ascii="Garamond" w:hAnsi="Garamond" w:cs="Arial"/>
+          <w:sz w:val="20"/>
+          <w:szCs w:val="20"/>
+        </w:rPr>
+        <w:t xml:space="preserve"> on where and how to make</w:t>
+      </w:r>
+      <w:r>
+        <w:rPr>
+          <w:rFonts w:ascii="Garamond" w:hAnsi="Garamond" w:cs="Arial"/>
+          <w:sz w:val="20"/>
+          <w:szCs w:val="20"/>
+        </w:rPr>
+        <w:t xml:space="preserve"> hour reductions</w:t>
+      </w:r>
+      <w:r>
+        <w:rPr>
+          <w:rFonts w:ascii="Garamond" w:hAnsi="Garamond" w:cs="Arial"/>
+          <w:sz w:val="20"/>
+          <w:szCs w:val="20"/>
+        </w:rPr>
+        <w:t xml:space="preserve">, resulting in no </w:t>
+      </w:r>
+      <w:r>
+        <w:rPr>
+          <w:rFonts w:ascii="Garamond" w:hAnsi="Garamond" w:cs="Arial"/>
+          <w:sz w:val="20"/>
+          <w:szCs w:val="20"/>
+        </w:rPr>
+        <w:t xml:space="preserve">layoffs across </w:t>
+      </w:r>
+      <w:r>
+        <w:rPr>
+          <w:rFonts w:ascii="Garamond" w:hAnsi="Garamond" w:cs="Arial"/>
+          <w:sz w:val="20"/>
+          <w:szCs w:val="20"/>
+        </w:rPr>
+        <w:t>twenty four</w:t>
+      </w:r>
+      <w:r>
+        <w:rPr>
+          <w:rFonts w:ascii="Garamond" w:hAnsi="Garamond" w:cs="Arial"/>
+          <w:sz w:val="20"/>
+          <w:szCs w:val="20"/>
+        </w:rPr>
+        <w:t xml:space="preserve"> location</w:t>
+      </w:r>
+      <w:r>
+        <w:rPr>
+          <w:rFonts w:ascii="Garamond" w:hAnsi="Garamond" w:cs="Arial"/>
+          <w:sz w:val="20"/>
+          <w:szCs w:val="20"/>
+        </w:rPr>
+        <w:t xml:space="preserve">s in 2020. </w:t>
       </w:r>
     </w:p>
     <w:p>
@@ -6436,6 +6273,16 @@
           <w:sz w:val="20"/>
           <w:szCs w:val="20"/>
         </w:rPr>
+        <w:t xml:space="preserve">Authored </w:t>
+      </w:r>
+      <w:r>
+        <w:rPr>
+          <w:rFonts w:ascii="Garamond" w:hAnsi="Garamond" w:cs="Arial"/>
+          <w:b/>
+          <w:bCs/>
+          <w:sz w:val="20"/>
+          <w:szCs w:val="20"/>
+        </w:rPr>
         <w:t>C</w:t>
       </w:r>
       <w:r>
@@ -6446,167 +6293,71 @@
           <w:sz w:val="20"/>
           <w:szCs w:val="20"/>
         </w:rPr>
-        <w:t>oached</w:t>
-      </w:r>
-      <w:r>
-        <w:rPr>
-          <w:rFonts w:ascii="Garamond" w:hAnsi="Garamond" w:cs="Arial"/>
-          <w:b/>
-          <w:bCs/>
-          <w:sz w:val="20"/>
-          <w:szCs w:val="20"/>
-        </w:rPr>
-        <w:t xml:space="preserve"> and Mentored</w:t>
-      </w:r>
-      <w:r>
-        <w:rPr>
-          <w:rFonts w:ascii="Garamond" w:hAnsi="Garamond" w:cs="Arial"/>
-          <w:b/>
-          <w:bCs/>
-          <w:sz w:val="20"/>
-          <w:szCs w:val="20"/>
-        </w:rPr>
-        <w:t xml:space="preserve"> a </w:t>
-      </w:r>
-      <w:r>
-        <w:rPr>
-          <w:rFonts w:ascii="Garamond" w:hAnsi="Garamond" w:cs="Arial"/>
-          <w:b/>
-          <w:bCs/>
-          <w:sz w:val="20"/>
-          <w:szCs w:val="20"/>
-        </w:rPr>
-        <w:t>T</w:t>
-      </w:r>
-      <w:r>
-        <w:rPr>
-          <w:rFonts w:ascii="Garamond" w:hAnsi="Garamond" w:cs="Arial"/>
-          <w:b/>
-          <w:bCs/>
-          <w:sz w:val="20"/>
-          <w:szCs w:val="20"/>
-        </w:rPr>
-        <w:t xml:space="preserve">eam of </w:t>
-      </w:r>
-      <w:r>
-        <w:rPr>
-          <w:rFonts w:ascii="Garamond" w:hAnsi="Garamond" w:cs="Arial"/>
-          <w:b/>
-          <w:bCs/>
-          <w:sz w:val="20"/>
-          <w:szCs w:val="20"/>
-        </w:rPr>
-        <w:t>A</w:t>
-      </w:r>
-      <w:r>
-        <w:rPr>
-          <w:rFonts w:ascii="Garamond" w:hAnsi="Garamond" w:cs="Arial"/>
-          <w:b/>
-          <w:bCs/>
-          <w:sz w:val="20"/>
-          <w:szCs w:val="20"/>
-        </w:rPr>
-        <w:t xml:space="preserve">nalysts and </w:t>
-      </w:r>
-      <w:r>
-        <w:rPr>
-          <w:rFonts w:ascii="Garamond" w:hAnsi="Garamond" w:cs="Arial"/>
-          <w:b/>
-          <w:bCs/>
-          <w:sz w:val="20"/>
-          <w:szCs w:val="20"/>
-        </w:rPr>
-        <w:t>S</w:t>
-      </w:r>
-      <w:r>
-        <w:rPr>
-          <w:rFonts w:ascii="Garamond" w:hAnsi="Garamond" w:cs="Arial"/>
-          <w:b/>
-          <w:bCs/>
-          <w:sz w:val="20"/>
-          <w:szCs w:val="20"/>
-        </w:rPr>
-        <w:t xml:space="preserve">pecialists </w:t>
-      </w:r>
-      <w:r>
-        <w:rPr>
-          <w:rFonts w:ascii="Garamond" w:hAnsi="Garamond" w:cs="Arial"/>
-          <w:b/>
-          <w:bCs/>
-          <w:sz w:val="20"/>
-          <w:szCs w:val="20"/>
-        </w:rPr>
-        <w:t>p</w:t>
-      </w:r>
-      <w:r>
-        <w:rPr>
-          <w:rFonts w:ascii="Garamond" w:hAnsi="Garamond" w:cs="Arial"/>
-          <w:b/>
-          <w:bCs/>
-          <w:sz w:val="20"/>
-          <w:szCs w:val="20"/>
-        </w:rPr>
-        <w:t xml:space="preserve">ost </w:t>
-      </w:r>
-      <w:r>
-        <w:rPr>
-          <w:rFonts w:ascii="Garamond" w:hAnsi="Garamond" w:cs="Arial"/>
-          <w:b/>
-          <w:bCs/>
-          <w:sz w:val="20"/>
-          <w:szCs w:val="20"/>
-        </w:rPr>
-        <w:t>C</w:t>
-      </w:r>
-      <w:r>
-        <w:rPr>
-          <w:rFonts w:ascii="Garamond" w:hAnsi="Garamond" w:cs="Arial"/>
-          <w:b/>
-          <w:bCs/>
-          <w:sz w:val="20"/>
-          <w:szCs w:val="20"/>
-        </w:rPr>
-        <w:t>onversion</w:t>
-      </w:r>
-      <w:r>
-        <w:rPr>
-          <w:rFonts w:ascii="Garamond" w:hAnsi="Garamond" w:cs="Arial"/>
-          <w:sz w:val="20"/>
-          <w:szCs w:val="20"/>
-        </w:rPr>
-        <w:t xml:space="preserve"> by redefining processes, </w:t>
-      </w:r>
-      <w:r>
-        <w:rPr>
-          <w:rFonts w:ascii="Garamond" w:hAnsi="Garamond" w:cs="Arial"/>
-          <w:sz w:val="20"/>
-          <w:szCs w:val="20"/>
-        </w:rPr>
-        <w:t>developing</w:t>
-      </w:r>
-      <w:r>
-        <w:rPr>
-          <w:rFonts w:ascii="Garamond" w:hAnsi="Garamond" w:cs="Arial"/>
-          <w:sz w:val="20"/>
-          <w:szCs w:val="20"/>
-        </w:rPr>
-        <w:t xml:space="preserve"> reporting, and guiding technology implementations that enabled </w:t>
-      </w:r>
-      <w:r>
-        <w:rPr>
-          <w:rFonts w:ascii="Garamond" w:hAnsi="Garamond" w:cs="Arial"/>
-          <w:sz w:val="20"/>
-          <w:szCs w:val="20"/>
-        </w:rPr>
-        <w:t>operational efficiencies</w:t>
-      </w:r>
-      <w:r>
-        <w:rPr>
-          <w:rFonts w:ascii="Garamond" w:hAnsi="Garamond" w:cs="Arial"/>
-          <w:sz w:val="20"/>
-          <w:szCs w:val="20"/>
-        </w:rPr>
-        <w:t>, adoption, and continuous improvement.</w:t>
+        <w:t xml:space="preserve">omprehensive </w:t>
+      </w:r>
+      <w:r>
+        <w:rPr>
+          <w:rFonts w:ascii="Garamond" w:hAnsi="Garamond" w:cs="Arial"/>
+          <w:b/>
+          <w:bCs/>
+          <w:sz w:val="20"/>
+          <w:szCs w:val="20"/>
+        </w:rPr>
+        <w:t>O</w:t>
+      </w:r>
+      <w:r>
+        <w:rPr>
+          <w:rFonts w:ascii="Garamond" w:hAnsi="Garamond" w:cs="Arial"/>
+          <w:b/>
+          <w:bCs/>
+          <w:sz w:val="20"/>
+          <w:szCs w:val="20"/>
+        </w:rPr>
+        <w:t xml:space="preserve">perational </w:t>
+      </w:r>
+      <w:r>
+        <w:rPr>
+          <w:rFonts w:ascii="Garamond" w:hAnsi="Garamond" w:cs="Arial"/>
+          <w:b/>
+          <w:bCs/>
+          <w:sz w:val="20"/>
+          <w:szCs w:val="20"/>
+        </w:rPr>
+        <w:t>D</w:t>
+      </w:r>
+      <w:r>
+        <w:rPr>
+          <w:rFonts w:ascii="Garamond" w:hAnsi="Garamond" w:cs="Arial"/>
+          <w:b/>
+          <w:bCs/>
+          <w:sz w:val="20"/>
+          <w:szCs w:val="20"/>
+        </w:rPr>
+        <w:t>ocumentation</w:t>
+      </w:r>
+      <w:r>
+        <w:rPr>
+          <w:rFonts w:ascii="Garamond" w:hAnsi="Garamond" w:cs="Arial"/>
+          <w:sz w:val="20"/>
+          <w:szCs w:val="20"/>
+        </w:rPr>
+        <w:t xml:space="preserve"> including </w:t>
+      </w:r>
+      <w:r>
+        <w:rPr>
+          <w:rFonts w:ascii="Garamond" w:hAnsi="Garamond" w:cs="Arial"/>
+          <w:sz w:val="20"/>
+          <w:szCs w:val="20"/>
+        </w:rPr>
+        <w:t>hundreds of</w:t>
+      </w:r>
+      <w:r>
+        <w:rPr>
+          <w:rFonts w:ascii="Garamond" w:hAnsi="Garamond" w:cs="Arial"/>
+          <w:sz w:val="20"/>
+          <w:szCs w:val="20"/>
+        </w:rPr>
+        <w:t xml:space="preserve"> pages of standard operating procedures, process improvement plans, and process flow diagrams that established clear roles, inputs, outputs, and quality checkpoints.</w:t>
       </w:r>
     </w:p>
     <w:p>
@@ -6632,27 +6383,57 @@
           <w:sz w:val="20"/>
           <w:szCs w:val="20"/>
         </w:rPr>
-        <w:t xml:space="preserve">Mastered SSMS and SQL </w:t>
-      </w:r>
-      <w:r>
-        <w:rPr>
-          <w:rFonts w:ascii="Garamond" w:hAnsi="Garamond" w:cs="Arial"/>
-          <w:b/>
-          <w:bCs/>
-          <w:sz w:val="20"/>
-          <w:szCs w:val="20"/>
-        </w:rPr>
-        <w:t>F</w:t>
-      </w:r>
-      <w:r>
-        <w:rPr>
-          <w:rFonts w:ascii="Garamond" w:hAnsi="Garamond" w:cs="Arial"/>
-          <w:b/>
-          <w:bCs/>
-          <w:sz w:val="20"/>
-          <w:szCs w:val="20"/>
-        </w:rPr>
-        <w:t xml:space="preserve">oundations and </w:t>
+        <w:t>C</w:t>
+      </w:r>
+      <w:r>
+        <w:rPr>
+          <w:rFonts w:ascii="Garamond" w:hAnsi="Garamond" w:cs="Arial"/>
+          <w:b/>
+          <w:bCs/>
+          <w:sz w:val="20"/>
+          <w:szCs w:val="20"/>
+        </w:rPr>
+        <w:t>oached</w:t>
+      </w:r>
+      <w:r>
+        <w:rPr>
+          <w:rFonts w:ascii="Garamond" w:hAnsi="Garamond" w:cs="Arial"/>
+          <w:b/>
+          <w:bCs/>
+          <w:sz w:val="20"/>
+          <w:szCs w:val="20"/>
+        </w:rPr>
+        <w:t xml:space="preserve"> and Mentored</w:t>
+      </w:r>
+      <w:r>
+        <w:rPr>
+          <w:rFonts w:ascii="Garamond" w:hAnsi="Garamond" w:cs="Arial"/>
+          <w:b/>
+          <w:bCs/>
+          <w:sz w:val="20"/>
+          <w:szCs w:val="20"/>
+        </w:rPr>
+        <w:t xml:space="preserve"> a </w:t>
+      </w:r>
+      <w:r>
+        <w:rPr>
+          <w:rFonts w:ascii="Garamond" w:hAnsi="Garamond" w:cs="Arial"/>
+          <w:b/>
+          <w:bCs/>
+          <w:sz w:val="20"/>
+          <w:szCs w:val="20"/>
+        </w:rPr>
+        <w:t>T</w:t>
+      </w:r>
+      <w:r>
+        <w:rPr>
+          <w:rFonts w:ascii="Garamond" w:hAnsi="Garamond" w:cs="Arial"/>
+          <w:b/>
+          <w:bCs/>
+          <w:sz w:val="20"/>
+          <w:szCs w:val="20"/>
+        </w:rPr>
+        <w:t xml:space="preserve">eam of </w:t>
       </w:r>
       <w:r>
         <w:rPr>
@@ -6672,79 +6453,107 @@
           <w:sz w:val="20"/>
           <w:szCs w:val="20"/>
         </w:rPr>
-        <w:t xml:space="preserve">utomated </w:t>
-      </w:r>
-      <w:r>
-        <w:rPr>
-          <w:rFonts w:ascii="Garamond" w:hAnsi="Garamond" w:cs="Arial"/>
-          <w:b/>
-          <w:bCs/>
-          <w:sz w:val="20"/>
-          <w:szCs w:val="20"/>
-        </w:rPr>
-        <w:t>R</w:t>
-      </w:r>
-      <w:r>
-        <w:rPr>
-          <w:rFonts w:ascii="Garamond" w:hAnsi="Garamond" w:cs="Arial"/>
-          <w:b/>
-          <w:bCs/>
-          <w:sz w:val="20"/>
-          <w:szCs w:val="20"/>
-        </w:rPr>
-        <w:t xml:space="preserve">ecurring </w:t>
-      </w:r>
-      <w:r>
-        <w:rPr>
-          <w:rFonts w:ascii="Garamond" w:hAnsi="Garamond" w:cs="Arial"/>
-          <w:b/>
-          <w:bCs/>
-          <w:sz w:val="20"/>
-          <w:szCs w:val="20"/>
-        </w:rPr>
-        <w:t>R</w:t>
-      </w:r>
-      <w:r>
-        <w:rPr>
-          <w:rFonts w:ascii="Garamond" w:hAnsi="Garamond" w:cs="Arial"/>
-          <w:b/>
-          <w:bCs/>
-          <w:sz w:val="20"/>
-          <w:szCs w:val="20"/>
-        </w:rPr>
-        <w:t>eporting</w:t>
-      </w:r>
-      <w:r>
-        <w:rPr>
-          <w:rFonts w:ascii="Garamond" w:hAnsi="Garamond" w:cs="Arial"/>
-          <w:sz w:val="20"/>
-          <w:szCs w:val="20"/>
-        </w:rPr>
-        <w:t xml:space="preserve"> </w:t>
-      </w:r>
-      <w:r>
-        <w:rPr>
-          <w:rFonts w:ascii="Garamond" w:hAnsi="Garamond" w:cs="Arial"/>
-          <w:sz w:val="19"/>
-          <w:szCs w:val="19"/>
-        </w:rPr>
-        <w:t xml:space="preserve">in Excel and Power BI for Operations and Sales, </w:t>
-      </w:r>
-      <w:r>
-        <w:rPr>
-          <w:rFonts w:ascii="Garamond" w:hAnsi="Garamond" w:cs="Arial"/>
-          <w:sz w:val="19"/>
-          <w:szCs w:val="19"/>
-        </w:rPr>
-        <w:t xml:space="preserve">HR, Procurement, and Marketing </w:t>
-      </w:r>
-      <w:r>
-        <w:rPr>
-          <w:rFonts w:ascii="Garamond" w:hAnsi="Garamond" w:cs="Arial"/>
-          <w:sz w:val="19"/>
-          <w:szCs w:val="19"/>
-        </w:rPr>
-        <w:t>standardizing definitions, schedules, and ownership to improve reliability and stakeholder trust.</w:t>
+        <w:t xml:space="preserve">nalysts and </w:t>
+      </w:r>
+      <w:r>
+        <w:rPr>
+          <w:rFonts w:ascii="Garamond" w:hAnsi="Garamond" w:cs="Arial"/>
+          <w:b/>
+          <w:bCs/>
+          <w:sz w:val="20"/>
+          <w:szCs w:val="20"/>
+        </w:rPr>
+        <w:t>S</w:t>
+      </w:r>
+      <w:r>
+        <w:rPr>
+          <w:rFonts w:ascii="Garamond" w:hAnsi="Garamond" w:cs="Arial"/>
+          <w:b/>
+          <w:bCs/>
+          <w:sz w:val="20"/>
+          <w:szCs w:val="20"/>
+        </w:rPr>
+        <w:t xml:space="preserve">pecialists </w:t>
+      </w:r>
+      <w:r>
+        <w:rPr>
+          <w:rFonts w:ascii="Garamond" w:hAnsi="Garamond" w:cs="Arial"/>
+          <w:b/>
+          <w:bCs/>
+          <w:sz w:val="20"/>
+          <w:szCs w:val="20"/>
+        </w:rPr>
+        <w:t>p</w:t>
+      </w:r>
+      <w:r>
+        <w:rPr>
+          <w:rFonts w:ascii="Garamond" w:hAnsi="Garamond" w:cs="Arial"/>
+          <w:b/>
+          <w:bCs/>
+          <w:sz w:val="20"/>
+          <w:szCs w:val="20"/>
+        </w:rPr>
+        <w:t xml:space="preserve">ost </w:t>
+      </w:r>
+      <w:r>
+        <w:rPr>
+          <w:rFonts w:ascii="Garamond" w:hAnsi="Garamond" w:cs="Arial"/>
+          <w:b/>
+          <w:bCs/>
+          <w:sz w:val="20"/>
+          <w:szCs w:val="20"/>
+        </w:rPr>
+        <w:t>C</w:t>
+      </w:r>
+      <w:r>
+        <w:rPr>
+          <w:rFonts w:ascii="Garamond" w:hAnsi="Garamond" w:cs="Arial"/>
+          <w:b/>
+          <w:bCs/>
+          <w:sz w:val="20"/>
+          <w:szCs w:val="20"/>
+        </w:rPr>
+        <w:t>onversion</w:t>
+      </w:r>
+      <w:r>
+        <w:rPr>
+          <w:rFonts w:ascii="Garamond" w:hAnsi="Garamond" w:cs="Arial"/>
+          <w:sz w:val="20"/>
+          <w:szCs w:val="20"/>
+        </w:rPr>
+        <w:t xml:space="preserve"> by redefining processes, </w:t>
+      </w:r>
+      <w:r>
+        <w:rPr>
+          <w:rFonts w:ascii="Garamond" w:hAnsi="Garamond" w:cs="Arial"/>
+          <w:sz w:val="20"/>
+          <w:szCs w:val="20"/>
+        </w:rPr>
+        <w:t>developing</w:t>
+      </w:r>
+      <w:r>
+        <w:rPr>
+          <w:rFonts w:ascii="Garamond" w:hAnsi="Garamond" w:cs="Arial"/>
+          <w:sz w:val="20"/>
+          <w:szCs w:val="20"/>
+        </w:rPr>
+        <w:t xml:space="preserve"> reporting, and guiding technology implementations that enabled </w:t>
+      </w:r>
+      <w:r>
+        <w:rPr>
+          <w:rFonts w:ascii="Garamond" w:hAnsi="Garamond" w:cs="Arial"/>
+          <w:sz w:val="20"/>
+          <w:szCs w:val="20"/>
+        </w:rPr>
+        <w:t>operational efficiencies</w:t>
+      </w:r>
+      <w:r>
+        <w:rPr>
+          <w:rFonts w:ascii="Garamond" w:hAnsi="Garamond" w:cs="Arial"/>
+          <w:sz w:val="20"/>
+          <w:szCs w:val="20"/>
+        </w:rPr>
+        <w:t>, adoption, and continuous improvement.</w:t>
       </w:r>
     </w:p>
     <w:p>
@@ -6770,6 +6579,144 @@
           <w:sz w:val="20"/>
           <w:szCs w:val="20"/>
         </w:rPr>
+        <w:t xml:space="preserve">Mastered SSMS and SQL </w:t>
+      </w:r>
+      <w:r>
+        <w:rPr>
+          <w:rFonts w:ascii="Garamond" w:hAnsi="Garamond" w:cs="Arial"/>
+          <w:b/>
+          <w:bCs/>
+          <w:sz w:val="20"/>
+          <w:szCs w:val="20"/>
+        </w:rPr>
+        <w:t>F</w:t>
+      </w:r>
+      <w:r>
+        <w:rPr>
+          <w:rFonts w:ascii="Garamond" w:hAnsi="Garamond" w:cs="Arial"/>
+          <w:b/>
+          <w:bCs/>
+          <w:sz w:val="20"/>
+          <w:szCs w:val="20"/>
+        </w:rPr>
+        <w:t xml:space="preserve">oundations and </w:t>
+      </w:r>
+      <w:r>
+        <w:rPr>
+          <w:rFonts w:ascii="Garamond" w:hAnsi="Garamond" w:cs="Arial"/>
+          <w:b/>
+          <w:bCs/>
+          <w:sz w:val="20"/>
+          <w:szCs w:val="20"/>
+        </w:rPr>
+        <w:t>A</w:t>
+      </w:r>
+      <w:r>
+        <w:rPr>
+          <w:rFonts w:ascii="Garamond" w:hAnsi="Garamond" w:cs="Arial"/>
+          <w:b/>
+          <w:bCs/>
+          <w:sz w:val="20"/>
+          <w:szCs w:val="20"/>
+        </w:rPr>
+        <w:t xml:space="preserve">utomated </w:t>
+      </w:r>
+      <w:r>
+        <w:rPr>
+          <w:rFonts w:ascii="Garamond" w:hAnsi="Garamond" w:cs="Arial"/>
+          <w:b/>
+          <w:bCs/>
+          <w:sz w:val="20"/>
+          <w:szCs w:val="20"/>
+        </w:rPr>
+        <w:t>R</w:t>
+      </w:r>
+      <w:r>
+        <w:rPr>
+          <w:rFonts w:ascii="Garamond" w:hAnsi="Garamond" w:cs="Arial"/>
+          <w:b/>
+          <w:bCs/>
+          <w:sz w:val="20"/>
+          <w:szCs w:val="20"/>
+        </w:rPr>
+        <w:t xml:space="preserve">ecurring </w:t>
+      </w:r>
+      <w:r>
+        <w:rPr>
+          <w:rFonts w:ascii="Garamond" w:hAnsi="Garamond" w:cs="Arial"/>
+          <w:b/>
+          <w:bCs/>
+          <w:sz w:val="20"/>
+          <w:szCs w:val="20"/>
+        </w:rPr>
+        <w:t>R</w:t>
+      </w:r>
+      <w:r>
+        <w:rPr>
+          <w:rFonts w:ascii="Garamond" w:hAnsi="Garamond" w:cs="Arial"/>
+          <w:b/>
+          <w:bCs/>
+          <w:sz w:val="20"/>
+          <w:szCs w:val="20"/>
+        </w:rPr>
+        <w:t>eporting</w:t>
+      </w:r>
+      <w:r>
+        <w:rPr>
+          <w:rFonts w:ascii="Garamond" w:hAnsi="Garamond" w:cs="Arial"/>
+          <w:sz w:val="20"/>
+          <w:szCs w:val="20"/>
+        </w:rPr>
+        <w:t xml:space="preserve"> </w:t>
+      </w:r>
+      <w:r>
+        <w:rPr>
+          <w:rFonts w:ascii="Garamond" w:hAnsi="Garamond" w:cs="Arial"/>
+          <w:sz w:val="19"/>
+          <w:szCs w:val="19"/>
+        </w:rPr>
+        <w:t xml:space="preserve">in Excel and Power BI for Operations and Sales, </w:t>
+      </w:r>
+      <w:r>
+        <w:rPr>
+          <w:rFonts w:ascii="Garamond" w:hAnsi="Garamond" w:cs="Arial"/>
+          <w:sz w:val="19"/>
+          <w:szCs w:val="19"/>
+        </w:rPr>
+        <w:t xml:space="preserve">HR, Procurement, and Marketing </w:t>
+      </w:r>
+      <w:r>
+        <w:rPr>
+          <w:rFonts w:ascii="Garamond" w:hAnsi="Garamond" w:cs="Arial"/>
+          <w:sz w:val="19"/>
+          <w:szCs w:val="19"/>
+        </w:rPr>
+        <w:t>standardizing definitions, schedules, and ownership to improve reliability and stakeholder trust.</w:t>
+      </w:r>
+    </w:p>
+    <w:p>
+      <w:pPr>
+        <w:pStyle w:val="ListParagraph"/>
+        <w:numPr>
+          <w:ilvl w:val="0"/>
+          <w:numId w:val="21"/>
+        </w:numPr>
+        <w:spacing w:after="0" w:line="324" w:lineRule="auto"/>
+        <w:ind w:left="540"/>
+        <w:rPr>
+          <w:rFonts w:ascii="Garamond" w:hAnsi="Garamond" w:cs="Arial"/>
+          <w:sz w:val="20"/>
+          <w:szCs w:val="20"/>
+        </w:rPr>
+      </w:pPr>
+      <w:r>
+        <w:rPr>
+          <w:rFonts w:ascii="Garamond" w:hAnsi="Garamond" w:cs="Arial"/>
+          <w:b/>
+          <w:bCs/>
+          <w:sz w:val="20"/>
+          <w:szCs w:val="20"/>
+        </w:rPr>
         <w:t>Developed</w:t>
       </w:r>
       <w:r>
@@ -7265,16 +7212,6 @@
         </w:rPr>
         <w:t xml:space="preserve"> defective/return rates and PO completeness. </w:t>
       </w:r>
-    </w:p>
-    <w:p>
-      <w:pPr>
-        <w:spacing w:after="0" w:line="324" w:lineRule="auto"/>
-        <w:rPr>
-          <w:rFonts w:ascii="Garamond" w:hAnsi="Garamond" w:cs="Arial"/>
-          <w:sz w:val="20"/>
-          <w:szCs w:val="20"/>
-        </w:rPr>
-      </w:pPr>
     </w:p>
     <w:p>
       <w:pPr>
@@ -9187,6 +9124,86 @@
         </w:rPr>
         <w:t>vendor donations to fund the Sheboygan County Veterans Memorial Lighting Project.</w:t>
       </w:r>
+    </w:p>
+    <w:p>
+      <w:pPr>
+        <w:spacing w:after="0" w:line="324" w:lineRule="auto"/>
+        <w:rPr>
+          <w:rFonts w:ascii="Garamond" w:hAnsi="Garamond" w:cs="Arial"/>
+          <w:sz w:val="20"/>
+          <w:szCs w:val="20"/>
+        </w:rPr>
+      </w:pPr>
+    </w:p>
+    <w:p>
+      <w:pPr>
+        <w:spacing w:after="0" w:line="324" w:lineRule="auto"/>
+        <w:rPr>
+          <w:rFonts w:ascii="Garamond" w:hAnsi="Garamond" w:cs="Arial"/>
+          <w:sz w:val="20"/>
+          <w:szCs w:val="20"/>
+        </w:rPr>
+      </w:pPr>
+    </w:p>
+    <w:p>
+      <w:pPr>
+        <w:spacing w:after="0" w:line="324" w:lineRule="auto"/>
+        <w:rPr>
+          <w:rFonts w:ascii="Garamond" w:hAnsi="Garamond" w:cs="Arial"/>
+          <w:sz w:val="20"/>
+          <w:szCs w:val="20"/>
+        </w:rPr>
+      </w:pPr>
+    </w:p>
+    <w:p>
+      <w:pPr>
+        <w:spacing w:after="0" w:line="324" w:lineRule="auto"/>
+        <w:rPr>
+          <w:rFonts w:ascii="Garamond" w:hAnsi="Garamond" w:cs="Arial"/>
+          <w:sz w:val="20"/>
+          <w:szCs w:val="20"/>
+        </w:rPr>
+      </w:pPr>
+    </w:p>
+    <w:p>
+      <w:pPr>
+        <w:spacing w:after="0" w:line="324" w:lineRule="auto"/>
+        <w:rPr>
+          <w:rFonts w:ascii="Garamond" w:hAnsi="Garamond" w:cs="Arial"/>
+          <w:sz w:val="20"/>
+          <w:szCs w:val="20"/>
+        </w:rPr>
+      </w:pPr>
+    </w:p>
+    <w:p>
+      <w:pPr>
+        <w:spacing w:after="0" w:line="324" w:lineRule="auto"/>
+        <w:rPr>
+          <w:rFonts w:ascii="Garamond" w:hAnsi="Garamond" w:cs="Arial"/>
+          <w:sz w:val="20"/>
+          <w:szCs w:val="20"/>
+        </w:rPr>
+      </w:pPr>
+    </w:p>
+    <w:p>
+      <w:pPr>
+        <w:spacing w:after="0" w:line="324" w:lineRule="auto"/>
+        <w:rPr>
+          <w:rFonts w:ascii="Garamond" w:hAnsi="Garamond" w:cs="Arial"/>
+          <w:sz w:val="20"/>
+          <w:szCs w:val="20"/>
+        </w:rPr>
+      </w:pPr>
+    </w:p>
+    <w:p>
+      <w:pPr>
+        <w:spacing w:after="0" w:line="324" w:lineRule="auto"/>
+        <w:rPr>
+          <w:rFonts w:ascii="Garamond" w:hAnsi="Garamond" w:cs="Arial"/>
+          <w:sz w:val="20"/>
+          <w:szCs w:val="20"/>
+        </w:rPr>
+      </w:pPr>
     </w:p>
     <w:sectPr>
       <w:type w:val="continuous"/>

</xml_diff>